<commit_message>
Update Parent Information Letter and Programme Overview documents
</commit_message>
<xml_diff>
--- a/outputs/Admin/Editable/Parent-Information-Letter.docx
+++ b/outputs/Admin/Editable/Parent-Information-Letter.docx
@@ -1,17 +1,17 @@
 
 <file path=word/document.xml><?xml version="1.0" encoding="utf-8"?>
-<w:document xmlns:wpc="http://schemas.microsoft.com/office/word/2010/wordprocessingCanvas" xmlns:mc="http://schemas.openxmlformats.org/markup-compatibility/2006" xmlns:o="urn:schemas-microsoft-com:office:office" xmlns:r="http://schemas.openxmlformats.org/officeDocument/2006/relationships" xmlns:m="http://schemas.openxmlformats.org/officeDocument/2006/math" xmlns:v="urn:schemas-microsoft-com:vml" xmlns:wp14="http://schemas.microsoft.com/office/word/2010/wordprocessingDrawing" xmlns:wp="http://schemas.openxmlformats.org/drawingml/2006/wordprocessingDrawing" xmlns:w10="urn:schemas-microsoft-com:office:word" xmlns:w="http://schemas.openxmlformats.org/wordprocessingml/2006/main" xmlns:w14="http://schemas.microsoft.com/office/word/2010/wordml" xmlns:w15="http://schemas.microsoft.com/office/word/2012/wordml" xmlns:wpg="http://schemas.microsoft.com/office/word/2010/wordprocessingGroup" xmlns:wpi="http://schemas.microsoft.com/office/word/2010/wordprocessingInk" xmlns:wne="http://schemas.microsoft.com/office/word/2006/wordml" xmlns:wps="http://schemas.microsoft.com/office/word/2010/wordprocessingShape" xmlns:cx="http://schemas.microsoft.com/office/drawing/2014/chartex" xmlns:cx1="http://schemas.microsoft.com/office/drawing/2015/9/8/chartex" xmlns:cx2="http://schemas.microsoft.com/office/drawing/2015/10/21/chartex" xmlns:cx3="http://schemas.microsoft.com/office/drawing/2016/5/9/chartex" xmlns:cx4="http://schemas.microsoft.com/office/drawing/2016/5/10/chartex" xmlns:cx5="http://schemas.microsoft.com/office/drawing/2016/5/11/chartex" xmlns:cx6="http://schemas.microsoft.com/office/drawing/2016/5/12/chartex" xmlns:cx7="http://schemas.microsoft.com/office/drawing/2016/5/13/chartex" xmlns:cx8="http://schemas.microsoft.com/office/drawing/2016/5/14/chartex" xmlns:aink="http://schemas.microsoft.com/office/drawing/2016/ink" xmlns:am3d="http://schemas.microsoft.com/office/drawing/2017/model3d" xmlns:w16cex="http://schemas.microsoft.com/office/word/2018/wordml/cex" xmlns:w16cid="http://schemas.microsoft.com/office/word/2016/wordml/cid" xmlns:w16="http://schemas.microsoft.com/office/word/2018/wordml" xmlns:w16sdtdh="http://schemas.microsoft.com/office/word/2020/wordml/sdtdatahash" xmlns:w16se="http://schemas.microsoft.com/office/word/2015/wordml/symex" mc:Ignorable="w14 w15 wp14">
+<w:document xmlns:wpc="http://schemas.microsoft.com/office/word/2010/wordprocessingCanvas" xmlns:mc="http://schemas.openxmlformats.org/markup-compatibility/2006" xmlns:o="urn:schemas-microsoft-com:office:office" xmlns:r="http://schemas.openxmlformats.org/officeDocument/2006/relationships" xmlns:m="http://schemas.openxmlformats.org/officeDocument/2006/math" xmlns:v="urn:schemas-microsoft-com:vml" xmlns:wp14="http://schemas.microsoft.com/office/word/2010/wordprocessingDrawing" xmlns:wp="http://schemas.openxmlformats.org/drawingml/2006/wordprocessingDrawing" xmlns:w10="urn:schemas-microsoft-com:office:word" xmlns:w="http://schemas.openxmlformats.org/wordprocessingml/2006/main" xmlns:w14="http://schemas.microsoft.com/office/word/2010/wordml" xmlns:w15="http://schemas.microsoft.com/office/word/2012/wordml" xmlns:w16se="http://schemas.microsoft.com/office/word/2015/wordml/symex" xmlns:w16cid="http://schemas.microsoft.com/office/word/2016/wordml/cid" xmlns:w16="http://schemas.microsoft.com/office/word/2018/wordml" xmlns:w16cex="http://schemas.microsoft.com/office/word/2018/wordml/cex" xmlns:w16sdtdh="http://schemas.microsoft.com/office/word/2020/wordml/sdtdatahash" xmlns:wne="http://schemas.microsoft.com/office/word/2006/wordml" xmlns:wpg="http://schemas.microsoft.com/office/word/2010/wordprocessingGroup" xmlns:wps="http://schemas.microsoft.com/office/word/2010/wordprocessingShape" mc:Ignorable="w14 w15 w16se w16cid w16 w16cex w16sdtdh wp14">
   <w:body>
     <w:tbl>
       <w:tblPr>
-        <w:tblW w:type="dxa" w:w="9638"/>
+        <w:tblW w:w="9638" w:type="dxa"/>
         <w:tblBorders>
-          <w:top w:val="single" w:color="auto" w:sz="4"/>
-          <w:left w:val="single" w:color="auto" w:sz="4"/>
-          <w:bottom w:val="single" w:color="auto" w:sz="4"/>
-          <w:right w:val="single" w:color="auto" w:sz="4"/>
-          <w:insideH w:val="single" w:color="auto" w:sz="4"/>
-          <w:insideV w:val="single" w:color="auto" w:sz="4"/>
+          <w:top w:val="single" w:sz="4" w:color="auto"/>
+          <w:left w:val="single" w:sz="4" w:color="auto"/>
+          <w:bottom w:val="single" w:sz="4" w:color="auto"/>
+          <w:right w:val="single" w:sz="4" w:color="auto"/>
+          <w:insideH w:val="single" w:sz="4" w:color="auto"/>
+          <w:insideV w:val="single" w:sz="4" w:color="auto"/>
         </w:tblBorders>
       </w:tblPr>
       <w:tblGrid>
@@ -21,18 +21,18 @@
       <w:tr>
         <w:tc>
           <w:tcPr>
-            <w:tcW w:type="dxa" w:w="1350"/>
+            <w:tcW w:w="1350" w:type="dxa"/>
             <w:tcBorders>
-              <w:top w:val="none" w:color="FFFFFF" w:sz="0"/>
-              <w:left w:val="none" w:color="FFFFFF" w:sz="0"/>
-              <w:bottom w:val="none" w:color="FFFFFF" w:sz="0"/>
-              <w:right w:val="none" w:color="FFFFFF" w:sz="0"/>
+              <w:top w:val="none"/>
+              <w:left w:val="none"/>
+              <w:bottom w:val="none"/>
+              <w:right w:val="none"/>
             </w:tcBorders>
             <w:tcMar>
-              <w:top w:type="dxa" w:w="0"/>
-              <w:left w:type="dxa" w:w="0"/>
-              <w:bottom w:type="dxa" w:w="0"/>
-              <w:right w:type="dxa" w:w="140"/>
+              <w:top w:w="0" w:type="dxa"/>
+              <w:left w:w="0" w:type="dxa"/>
+              <w:bottom w:w="0" w:type="dxa"/>
+              <w:right w:w="140" w:type="dxa"/>
             </w:tcMar>
             <w:vAlign w:val="center"/>
           </w:tcPr>
@@ -44,8 +44,8 @@
               <w:drawing>
                 <wp:inline distT="0" distB="0" distL="0" distR="0">
                   <wp:extent cx="647700" cy="647700"/>
-                  <wp:effectExtent t="0" r="0" b="0" l="0"/>
-                  <wp:docPr id="1" name="" descr="" title=""/>
+                  <wp:effectExtent l="0" t="0" r="0" b="0"/>
+                  <wp:docPr id="100000" name="Picture 100000"/>
                   <wp:cNvGraphicFramePr>
                     <a:graphicFrameLocks xmlns:a="http://schemas.openxmlformats.org/drawingml/2006/main" noChangeAspect="1"/>
                   </wp:cNvGraphicFramePr>
@@ -53,19 +53,16 @@
                     <a:graphicData uri="http://schemas.openxmlformats.org/drawingml/2006/picture">
                       <pic:pic xmlns:pic="http://schemas.openxmlformats.org/drawingml/2006/picture">
                         <pic:nvPicPr>
-                          <pic:cNvPr id="0" name="" descr=""/>
-                          <pic:cNvPicPr>
-                            <a:picLocks noChangeAspect="1" noChangeArrowheads="1"/>
-                          </pic:cNvPicPr>
+                          <pic:cNvPr id="100000" name="image100000"/>
+                          <pic:cNvPicPr/>
                         </pic:nvPicPr>
                         <pic:blipFill>
-                          <a:blip r:embed="rId8" cstate="none"/>
-                          <a:srcRect/>
+                          <a:blip r:embed="rId11"/>
                           <a:stretch>
                             <a:fillRect/>
                           </a:stretch>
                         </pic:blipFill>
-                        <pic:spPr bwMode="auto">
+                        <pic:spPr>
                           <a:xfrm>
                             <a:off x="0" y="0"/>
                             <a:ext cx="647700" cy="647700"/>
@@ -84,18 +81,18 @@
         </w:tc>
         <w:tc>
           <w:tcPr>
-            <w:tcW w:type="dxa" w:w="8288"/>
+            <w:tcW w:w="8288" w:type="dxa"/>
             <w:tcBorders>
-              <w:top w:val="none" w:color="FFFFFF" w:sz="0"/>
-              <w:left w:val="none" w:color="FFFFFF" w:sz="0"/>
-              <w:bottom w:val="none" w:color="FFFFFF" w:sz="0"/>
-              <w:right w:val="none" w:color="FFFFFF" w:sz="0"/>
+              <w:top w:val="none"/>
+              <w:left w:val="none"/>
+              <w:bottom w:val="none"/>
+              <w:right w:val="none"/>
             </w:tcBorders>
             <w:tcMar>
-              <w:top w:type="dxa" w:w="0"/>
-              <w:left w:type="dxa" w:w="0"/>
-              <w:bottom w:type="dxa" w:w="0"/>
-              <w:right w:type="dxa" w:w="0"/>
+              <w:top w:w="0" w:type="dxa"/>
+              <w:left w:w="0" w:type="dxa"/>
+              <w:bottom w:w="0" w:type="dxa"/>
+              <w:right w:w="0" w:type="dxa"/>
             </w:tcMar>
             <w:vAlign w:val="center"/>
           </w:tcPr>
@@ -105,7 +102,7 @@
             </w:pPr>
             <w:r>
               <w:rPr>
-                <w:rFonts w:ascii="Nunito Sans" w:cs="Nunito Sans" w:eastAsia="Nunito Sans" w:hAnsi="Nunito Sans"/>
+                <w:rFonts w:ascii="Nunito Sans" w:hAnsi="Nunito Sans" w:eastAsia="Nunito Sans" w:cs="Nunito Sans"/>
                 <w:b/>
                 <w:bCs/>
                 <w:caps/>
@@ -123,14 +120,14 @@
             </w:pPr>
             <w:r>
               <w:rPr>
-                <w:rFonts w:ascii="Fredoka" w:cs="Fredoka" w:eastAsia="Fredoka" w:hAnsi="Fredoka"/>
+                <w:rFonts w:ascii="Fredoka" w:hAnsi="Fredoka" w:eastAsia="Fredoka" w:cs="Fredoka"/>
                 <w:b/>
                 <w:bCs/>
                 <w:color w:val="8C2332"/>
                 <w:sz w:val="40"/>
                 <w:szCs w:val="40"/>
               </w:rPr>
-              <w:t xml:space="preserve">Parent Information</w:t>
+              <w:t>Parent Information</w:t>
             </w:r>
           </w:p>
         </w:tc>
@@ -139,21 +136,21 @@
     <w:p>
       <w:pPr>
         <w:pBdr>
-          <w:bottom w:val="single" w:color="8C2332" w:sz="14" w:space="4"/>
+          <w:bottom w:val="single" w:sz="14" w:space="4" w:color="8C2332"/>
         </w:pBdr>
-        <w:spacing w:after="200" w:before="60"/>
+        <w:spacing w:before="60" w:after="200"/>
       </w:pPr>
     </w:p>
     <w:tbl>
       <w:tblPr>
-        <w:tblW w:type="dxa" w:w="9638"/>
+        <w:tblW w:w="9638" w:type="dxa"/>
         <w:tblBorders>
-          <w:top w:val="single" w:color="auto" w:sz="4"/>
-          <w:left w:val="single" w:color="auto" w:sz="4"/>
-          <w:bottom w:val="single" w:color="auto" w:sz="4"/>
-          <w:right w:val="single" w:color="auto" w:sz="4"/>
-          <w:insideH w:val="single" w:color="auto" w:sz="4"/>
-          <w:insideV w:val="single" w:color="auto" w:sz="4"/>
+          <w:top w:val="single" w:sz="4" w:color="auto"/>
+          <w:left w:val="single" w:sz="4" w:color="auto"/>
+          <w:bottom w:val="single" w:sz="4" w:color="auto"/>
+          <w:right w:val="single" w:sz="4" w:color="auto"/>
+          <w:insideH w:val="single" w:sz="4" w:color="auto"/>
+          <w:insideV w:val="single" w:sz="4" w:color="auto"/>
         </w:tblBorders>
       </w:tblPr>
       <w:tblGrid>
@@ -162,19 +159,19 @@
       <w:tr>
         <w:tc>
           <w:tcPr>
-            <w:tcW w:type="dxa" w:w="9638"/>
+            <w:tcW w:w="9638" w:type="dxa"/>
             <w:tcBorders>
-              <w:top w:val="none" w:color="FFFFFF" w:sz="0"/>
-              <w:left w:val="single" w:color="C9A227" w:sz="18"/>
-              <w:bottom w:val="none" w:color="FFFFFF" w:sz="0"/>
-              <w:right w:val="none" w:color="FFFFFF" w:sz="0"/>
+              <w:top w:val="none"/>
+              <w:left w:val="single" w:sz="18" w:color="C9A227"/>
+              <w:bottom w:val="none"/>
+              <w:right w:val="none"/>
             </w:tcBorders>
-            <w:shd w:fill="FBF5E8" w:color="auto" w:val="clear"/>
+            <w:shd w:val="clear" w:fill="FBF5E8"/>
             <w:tcMar>
-              <w:top w:type="dxa" w:w="130"/>
-              <w:left w:type="dxa" w:w="180"/>
-              <w:bottom w:type="dxa" w:w="130"/>
-              <w:right w:type="dxa" w:w="160"/>
+              <w:top w:w="130" w:type="dxa"/>
+              <w:left w:w="180" w:type="dxa"/>
+              <w:bottom w:w="130" w:type="dxa"/>
+              <w:right w:w="160" w:type="dxa"/>
             </w:tcMar>
           </w:tcPr>
           <w:p>
@@ -183,16 +180,14 @@
             </w:pPr>
             <w:r>
               <w:rPr>
-                <w:rFonts w:ascii="Nunito Sans" w:cs="Nunito Sans" w:eastAsia="Nunito Sans" w:hAnsi="Nunito Sans"/>
+                <w:rFonts w:ascii="Nunito Sans" w:hAnsi="Nunito Sans" w:eastAsia="Nunito Sans" w:cs="Nunito Sans"/>
                 <w:b/>
                 <w:bCs/>
-                <w:i w:val="false"/>
-                <w:iCs w:val="false"/>
                 <w:color w:val="4A3A36"/>
                 <w:sz w:val="19"/>
                 <w:szCs w:val="19"/>
               </w:rPr>
-              <w:t xml:space="preserve">Everything highlighted in yellow needs filling in before this goes out. Delete this box when you are done.</w:t>
+              <w:t>Everything highlighted in yellow needs filling in before this goes out. Delete this box when you are done.</w:t>
             </w:r>
           </w:p>
         </w:tc>
@@ -207,15 +202,13 @@
       <w:pPr>
         <w:pStyle w:val="Heading3"/>
         <w:keepNext/>
-        <w:spacing w:after="80" w:before="260"/>
-      </w:pPr>
-      <w:r>
-        <w:rPr>
-          <w:rFonts w:ascii="Fredoka" w:cs="Fredoka" w:eastAsia="Fredoka" w:hAnsi="Fredoka"/>
-          <w:b/>
-          <w:bCs/>
-          <w:i w:val="false"/>
-          <w:iCs w:val="false"/>
+        <w:spacing w:before="260" w:after="80"/>
+      </w:pPr>
+      <w:r>
+        <w:rPr>
+          <w:rFonts w:ascii="Fredoka" w:hAnsi="Fredoka" w:eastAsia="Fredoka" w:cs="Fredoka"/>
+          <w:b/>
+          <w:bCs/>
           <w:color w:val="2E1015"/>
           <w:sz w:val="23"/>
           <w:szCs w:val="23"/>
@@ -224,18 +217,15 @@
       </w:r>
       <w:r>
         <w:rPr>
-          <w:rFonts w:ascii="Fredoka" w:cs="Fredoka" w:eastAsia="Fredoka" w:hAnsi="Fredoka"/>
-          <w:b/>
-          <w:bCs/>
-          <w:i w:val="false"/>
-          <w:iCs w:val="false"/>
+          <w:rFonts w:ascii="Fredoka" w:hAnsi="Fredoka" w:eastAsia="Fredoka" w:cs="Fredoka"/>
+          <w:b/>
+          <w:bCs/>
           <w:color w:val="2E1015"/>
           <w:sz w:val="23"/>
           <w:szCs w:val="23"/>
           <w:highlight w:val="yellow"/>
-          <w:highlightCs w:val="yellow"/>
-        </w:rPr>
-        <w:t xml:space="preserve">[DATE]</w:t>
+        </w:rPr>
+        <w:t>[DATE]</w:t>
       </w:r>
     </w:p>
     <w:p>
@@ -244,16 +234,12 @@
       </w:pPr>
       <w:r>
         <w:rPr>
-          <w:rFonts w:ascii="Nunito Sans" w:cs="Nunito Sans" w:eastAsia="Nunito Sans" w:hAnsi="Nunito Sans"/>
-          <w:b w:val="false"/>
-          <w:bCs w:val="false"/>
-          <w:i w:val="false"/>
-          <w:iCs w:val="false"/>
-          <w:color w:val="4A3A36"/>
-          <w:sz w:val="20"/>
-          <w:szCs w:val="20"/>
-        </w:rPr>
-        <w:t xml:space="preserve">Dear parents and caregivers,</w:t>
+          <w:rFonts w:ascii="Nunito Sans" w:hAnsi="Nunito Sans" w:eastAsia="Nunito Sans" w:cs="Nunito Sans"/>
+          <w:color w:val="4A3A36"/>
+          <w:sz w:val="20"/>
+          <w:szCs w:val="20"/>
+        </w:rPr>
+        <w:t>Dear parents and caregivers,</w:t>
       </w:r>
     </w:p>
     <w:p>
@@ -262,16 +248,12 @@
       </w:pPr>
       <w:r>
         <w:rPr>
-          <w:rFonts w:ascii="Nunito Sans" w:cs="Nunito Sans" w:eastAsia="Nunito Sans" w:hAnsi="Nunito Sans"/>
-          <w:b w:val="false"/>
-          <w:bCs w:val="false"/>
-          <w:i w:val="false"/>
-          <w:iCs w:val="false"/>
-          <w:color w:val="4A3A36"/>
-          <w:sz w:val="20"/>
-          <w:szCs w:val="20"/>
-        </w:rPr>
-        <w:t xml:space="preserve">The Kerala Cultural Club is starting a coding club for children aged 7 to 12 — Game Makers, the first class under our new KCC Code Club — and we'd love your child to join us.</w:t>
+          <w:rFonts w:ascii="Nunito Sans" w:hAnsi="Nunito Sans" w:eastAsia="Nunito Sans" w:cs="Nunito Sans"/>
+          <w:color w:val="4A3A36"/>
+          <w:sz w:val="20"/>
+          <w:szCs w:val="20"/>
+        </w:rPr>
+        <w:t>The Kerala Cultural Club is starting a coding club for children aged 7 to 12 — Game Makers, the first class under our new KCC Code Club — and we'd love your child to join us.</w:t>
       </w:r>
     </w:p>
     <w:p>
@@ -280,16 +262,12 @@
       </w:pPr>
       <w:r>
         <w:rPr>
-          <w:rFonts w:ascii="Nunito Sans" w:cs="Nunito Sans" w:eastAsia="Nunito Sans" w:hAnsi="Nunito Sans"/>
-          <w:b w:val="false"/>
-          <w:bCs w:val="false"/>
-          <w:i w:val="false"/>
-          <w:iCs w:val="false"/>
-          <w:color w:val="4A3A36"/>
-          <w:sz w:val="20"/>
-          <w:szCs w:val="20"/>
-        </w:rPr>
-        <w:t xml:space="preserve">Over eight weekly sessions, the children will learn the real foundations of programming — how to give a computer instructions, how to make decisions and repeat things, how to store information, and above all how to work out why something isn't doing what they expected. They will do all of this by building their own arcade game, which grows a little every week. On the last day, you're invited to come and watch them demo what they made.</w:t>
+          <w:rFonts w:ascii="Nunito Sans" w:hAnsi="Nunito Sans" w:eastAsia="Nunito Sans" w:cs="Nunito Sans"/>
+          <w:color w:val="4A3A36"/>
+          <w:sz w:val="20"/>
+          <w:szCs w:val="20"/>
+        </w:rPr>
+        <w:t>Over eight weekly sessions, the children will learn the real foundations of programming — how to give a computer instructions, how to make decisions and repeat things, how to store information, and above all how to work out why something isn't doing what they expected. They will do all of this by building their own arcade game, which grows a little every week. On the last day, you're invited to come and watch them demo what they made.</w:t>
       </w:r>
     </w:p>
     <w:p>
@@ -298,48 +276,42 @@
       </w:pPr>
       <w:r>
         <w:rPr>
-          <w:rFonts w:ascii="Nunito Sans" w:cs="Nunito Sans" w:eastAsia="Nunito Sans" w:hAnsi="Nunito Sans"/>
-          <w:b w:val="false"/>
-          <w:bCs w:val="false"/>
-          <w:i w:val="false"/>
-          <w:iCs w:val="false"/>
-          <w:color w:val="4A3A36"/>
-          <w:sz w:val="20"/>
-          <w:szCs w:val="20"/>
-        </w:rPr>
-        <w:t xml:space="preserve">No experience is needed. Most of them will never have written a line of code before, and that's exactly who this is for.</w:t>
+          <w:rFonts w:ascii="Nunito Sans" w:hAnsi="Nunito Sans" w:eastAsia="Nunito Sans" w:cs="Nunito Sans"/>
+          <w:color w:val="4A3A36"/>
+          <w:sz w:val="20"/>
+          <w:szCs w:val="20"/>
+        </w:rPr>
+        <w:t>No experience is needed. Most of them will never have written a line of code before, and that's exactly who this is for.</w:t>
       </w:r>
     </w:p>
     <w:p>
       <w:pPr>
         <w:pStyle w:val="Heading3"/>
         <w:keepNext/>
-        <w:spacing w:after="80" w:before="260"/>
-      </w:pPr>
-      <w:r>
-        <w:rPr>
-          <w:rFonts w:ascii="Fredoka" w:cs="Fredoka" w:eastAsia="Fredoka" w:hAnsi="Fredoka"/>
-          <w:b/>
-          <w:bCs/>
-          <w:i w:val="false"/>
-          <w:iCs w:val="false"/>
+        <w:spacing w:before="260" w:after="80"/>
+      </w:pPr>
+      <w:r>
+        <w:rPr>
+          <w:rFonts w:ascii="Fredoka" w:hAnsi="Fredoka" w:eastAsia="Fredoka" w:cs="Fredoka"/>
+          <w:b/>
+          <w:bCs/>
           <w:color w:val="2E1015"/>
           <w:sz w:val="23"/>
           <w:szCs w:val="23"/>
         </w:rPr>
-        <w:t xml:space="preserve">The practical details</w:t>
+        <w:t>The practical details</w:t>
       </w:r>
     </w:p>
     <w:tbl>
       <w:tblPr>
-        <w:tblW w:type="dxa" w:w="9638"/>
+        <w:tblW w:w="9638" w:type="dxa"/>
         <w:tblBorders>
-          <w:top w:val="single" w:color="auto" w:sz="4"/>
-          <w:left w:val="single" w:color="auto" w:sz="4"/>
-          <w:bottom w:val="single" w:color="auto" w:sz="4"/>
-          <w:right w:val="single" w:color="auto" w:sz="4"/>
-          <w:insideH w:val="single" w:color="auto" w:sz="4"/>
-          <w:insideV w:val="single" w:color="auto" w:sz="4"/>
+          <w:top w:val="single" w:sz="4" w:color="auto"/>
+          <w:left w:val="single" w:sz="4" w:color="auto"/>
+          <w:bottom w:val="single" w:sz="4" w:color="auto"/>
+          <w:right w:val="single" w:sz="4" w:color="auto"/>
+          <w:insideH w:val="single" w:sz="4" w:color="auto"/>
+          <w:insideV w:val="single" w:sz="4" w:color="auto"/>
         </w:tblBorders>
       </w:tblPr>
       <w:tblGrid>
@@ -352,18 +324,18 @@
         </w:trPr>
         <w:tc>
           <w:tcPr>
-            <w:tcW w:type="dxa" w:w="1157"/>
+            <w:tcW w:w="1157" w:type="dxa"/>
             <w:tcBorders>
-              <w:top w:val="single" w:color="DCCBA8" w:sz="4"/>
-              <w:left w:val="single" w:color="DCCBA8" w:sz="4"/>
-              <w:bottom w:val="single" w:color="DCCBA8" w:sz="4"/>
-              <w:right w:val="single" w:color="DCCBA8" w:sz="4"/>
+              <w:top w:val="single" w:sz="4" w:color="DCCBA8"/>
+              <w:left w:val="single" w:sz="4" w:color="DCCBA8"/>
+              <w:bottom w:val="single" w:sz="4" w:color="DCCBA8"/>
+              <w:right w:val="single" w:sz="4" w:color="DCCBA8"/>
             </w:tcBorders>
             <w:tcMar>
-              <w:top w:type="dxa" w:w="90"/>
-              <w:left w:type="dxa" w:w="110"/>
-              <w:bottom w:type="dxa" w:w="90"/>
-              <w:right w:type="dxa" w:w="110"/>
+              <w:top w:w="90" w:type="dxa"/>
+              <w:left w:w="110" w:type="dxa"/>
+              <w:bottom w:w="90" w:type="dxa"/>
+              <w:right w:w="110" w:type="dxa"/>
             </w:tcMar>
             <w:vAlign w:val="top"/>
           </w:tcPr>
@@ -373,33 +345,31 @@
             </w:pPr>
             <w:r>
               <w:rPr>
-                <w:rFonts w:ascii="Nunito Sans" w:cs="Nunito Sans" w:eastAsia="Nunito Sans" w:hAnsi="Nunito Sans"/>
+                <w:rFonts w:ascii="Nunito Sans" w:hAnsi="Nunito Sans" w:eastAsia="Nunito Sans" w:cs="Nunito Sans"/>
                 <w:b/>
                 <w:bCs/>
-                <w:i w:val="false"/>
-                <w:iCs w:val="false"/>
                 <w:color w:val="2E1015"/>
                 <w:sz w:val="18"/>
                 <w:szCs w:val="18"/>
               </w:rPr>
-              <w:t xml:space="preserve">Ages</w:t>
+              <w:t>Ages</w:t>
             </w:r>
           </w:p>
         </w:tc>
         <w:tc>
           <w:tcPr>
-            <w:tcW w:type="dxa" w:w="8481"/>
+            <w:tcW w:w="8481" w:type="dxa"/>
             <w:tcBorders>
-              <w:top w:val="single" w:color="DCCBA8" w:sz="4"/>
-              <w:left w:val="single" w:color="DCCBA8" w:sz="4"/>
-              <w:bottom w:val="single" w:color="DCCBA8" w:sz="4"/>
-              <w:right w:val="single" w:color="DCCBA8" w:sz="4"/>
+              <w:top w:val="single" w:sz="4" w:color="DCCBA8"/>
+              <w:left w:val="single" w:sz="4" w:color="DCCBA8"/>
+              <w:bottom w:val="single" w:sz="4" w:color="DCCBA8"/>
+              <w:right w:val="single" w:sz="4" w:color="DCCBA8"/>
             </w:tcBorders>
             <w:tcMar>
-              <w:top w:type="dxa" w:w="90"/>
-              <w:left w:type="dxa" w:w="110"/>
-              <w:bottom w:type="dxa" w:w="90"/>
-              <w:right w:type="dxa" w:w="110"/>
+              <w:top w:w="90" w:type="dxa"/>
+              <w:left w:w="110" w:type="dxa"/>
+              <w:bottom w:w="90" w:type="dxa"/>
+              <w:right w:w="110" w:type="dxa"/>
             </w:tcMar>
             <w:vAlign w:val="top"/>
           </w:tcPr>
@@ -409,16 +379,12 @@
             </w:pPr>
             <w:r>
               <w:rPr>
-                <w:rFonts w:ascii="Nunito Sans" w:cs="Nunito Sans" w:eastAsia="Nunito Sans" w:hAnsi="Nunito Sans"/>
-                <w:b w:val="false"/>
-                <w:bCs w:val="false"/>
-                <w:i w:val="false"/>
-                <w:iCs w:val="false"/>
+                <w:rFonts w:ascii="Nunito Sans" w:hAnsi="Nunito Sans" w:eastAsia="Nunito Sans" w:cs="Nunito Sans"/>
                 <w:color w:val="4A3A36"/>
                 <w:sz w:val="18"/>
                 <w:szCs w:val="18"/>
               </w:rPr>
-              <w:t xml:space="preserve">7–12</w:t>
+              <w:t>7–12</w:t>
             </w:r>
           </w:p>
         </w:tc>
@@ -429,18 +395,18 @@
         </w:trPr>
         <w:tc>
           <w:tcPr>
-            <w:tcW w:type="dxa" w:w="1157"/>
+            <w:tcW w:w="1157" w:type="dxa"/>
             <w:tcBorders>
-              <w:top w:val="single" w:color="DCCBA8" w:sz="4"/>
-              <w:left w:val="single" w:color="DCCBA8" w:sz="4"/>
-              <w:bottom w:val="single" w:color="DCCBA8" w:sz="4"/>
-              <w:right w:val="single" w:color="DCCBA8" w:sz="4"/>
+              <w:top w:val="single" w:sz="4" w:color="DCCBA8"/>
+              <w:left w:val="single" w:sz="4" w:color="DCCBA8"/>
+              <w:bottom w:val="single" w:sz="4" w:color="DCCBA8"/>
+              <w:right w:val="single" w:sz="4" w:color="DCCBA8"/>
             </w:tcBorders>
             <w:tcMar>
-              <w:top w:type="dxa" w:w="90"/>
-              <w:left w:type="dxa" w:w="110"/>
-              <w:bottom w:type="dxa" w:w="90"/>
-              <w:right w:type="dxa" w:w="110"/>
+              <w:top w:w="90" w:type="dxa"/>
+              <w:left w:w="110" w:type="dxa"/>
+              <w:bottom w:w="90" w:type="dxa"/>
+              <w:right w:w="110" w:type="dxa"/>
             </w:tcMar>
             <w:vAlign w:val="top"/>
           </w:tcPr>
@@ -450,33 +416,31 @@
             </w:pPr>
             <w:r>
               <w:rPr>
-                <w:rFonts w:ascii="Nunito Sans" w:cs="Nunito Sans" w:eastAsia="Nunito Sans" w:hAnsi="Nunito Sans"/>
+                <w:rFonts w:ascii="Nunito Sans" w:hAnsi="Nunito Sans" w:eastAsia="Nunito Sans" w:cs="Nunito Sans"/>
                 <w:b/>
                 <w:bCs/>
-                <w:i w:val="false"/>
-                <w:iCs w:val="false"/>
                 <w:color w:val="2E1015"/>
                 <w:sz w:val="18"/>
                 <w:szCs w:val="18"/>
               </w:rPr>
-              <w:t xml:space="preserve">When</w:t>
+              <w:t>When</w:t>
             </w:r>
           </w:p>
         </w:tc>
         <w:tc>
           <w:tcPr>
-            <w:tcW w:type="dxa" w:w="8481"/>
+            <w:tcW w:w="8481" w:type="dxa"/>
             <w:tcBorders>
-              <w:top w:val="single" w:color="DCCBA8" w:sz="4"/>
-              <w:left w:val="single" w:color="DCCBA8" w:sz="4"/>
-              <w:bottom w:val="single" w:color="DCCBA8" w:sz="4"/>
-              <w:right w:val="single" w:color="DCCBA8" w:sz="4"/>
+              <w:top w:val="single" w:sz="4" w:color="DCCBA8"/>
+              <w:left w:val="single" w:sz="4" w:color="DCCBA8"/>
+              <w:bottom w:val="single" w:sz="4" w:color="DCCBA8"/>
+              <w:right w:val="single" w:sz="4" w:color="DCCBA8"/>
             </w:tcBorders>
             <w:tcMar>
-              <w:top w:type="dxa" w:w="90"/>
-              <w:left w:type="dxa" w:w="110"/>
-              <w:bottom w:type="dxa" w:w="90"/>
-              <w:right w:type="dxa" w:w="110"/>
+              <w:top w:w="90" w:type="dxa"/>
+              <w:left w:w="110" w:type="dxa"/>
+              <w:bottom w:w="90" w:type="dxa"/>
+              <w:right w:w="110" w:type="dxa"/>
             </w:tcMar>
             <w:vAlign w:val="top"/>
           </w:tcPr>
@@ -486,26 +450,19 @@
             </w:pPr>
             <w:r>
               <w:rPr>
-                <w:rFonts w:ascii="Nunito Sans" w:cs="Nunito Sans" w:eastAsia="Nunito Sans" w:hAnsi="Nunito Sans"/>
+                <w:rFonts w:ascii="Nunito Sans" w:hAnsi="Nunito Sans" w:eastAsia="Nunito Sans" w:cs="Nunito Sans"/>
                 <w:b/>
                 <w:bCs/>
-                <w:i w:val="false"/>
-                <w:iCs w:val="false"/>
                 <w:color w:val="2E1015"/>
                 <w:sz w:val="18"/>
                 <w:szCs w:val="18"/>
                 <w:highlight w:val="yellow"/>
-                <w:highlightCs w:val="yellow"/>
-              </w:rPr>
-              <w:t xml:space="preserve">[DAY]</w:t>
-            </w:r>
-            <w:r>
-              <w:rPr>
-                <w:rFonts w:ascii="Nunito Sans" w:cs="Nunito Sans" w:eastAsia="Nunito Sans" w:hAnsi="Nunito Sans"/>
-                <w:b w:val="false"/>
-                <w:bCs w:val="false"/>
-                <w:i w:val="false"/>
-                <w:iCs w:val="false"/>
+              </w:rPr>
+              <w:t>[DAY]</w:t>
+            </w:r>
+            <w:r>
+              <w:rPr>
+                <w:rFonts w:ascii="Nunito Sans" w:hAnsi="Nunito Sans" w:eastAsia="Nunito Sans" w:cs="Nunito Sans"/>
                 <w:color w:val="4A3A36"/>
                 <w:sz w:val="18"/>
                 <w:szCs w:val="18"/>
@@ -514,54 +471,40 @@
             </w:r>
             <w:r>
               <w:rPr>
-                <w:rFonts w:ascii="Nunito Sans" w:cs="Nunito Sans" w:eastAsia="Nunito Sans" w:hAnsi="Nunito Sans"/>
+                <w:rFonts w:ascii="Nunito Sans" w:hAnsi="Nunito Sans" w:eastAsia="Nunito Sans" w:cs="Nunito Sans"/>
                 <w:b/>
                 <w:bCs/>
-                <w:i w:val="false"/>
-                <w:iCs w:val="false"/>
                 <w:color w:val="2E1015"/>
                 <w:sz w:val="18"/>
                 <w:szCs w:val="18"/>
                 <w:highlight w:val="yellow"/>
-                <w:highlightCs w:val="yellow"/>
-              </w:rPr>
-              <w:t xml:space="preserve">[TIME]</w:t>
-            </w:r>
-            <w:r>
-              <w:rPr>
-                <w:rFonts w:ascii="Nunito Sans" w:cs="Nunito Sans" w:eastAsia="Nunito Sans" w:hAnsi="Nunito Sans"/>
-                <w:b w:val="false"/>
-                <w:bCs w:val="false"/>
-                <w:i w:val="false"/>
-                <w:iCs w:val="false"/>
+              </w:rPr>
+              <w:t>[TIME]</w:t>
+            </w:r>
+            <w:r>
+              <w:rPr>
+                <w:rFonts w:ascii="Nunito Sans" w:hAnsi="Nunito Sans" w:eastAsia="Nunito Sans" w:cs="Nunito Sans"/>
                 <w:color w:val="4A3A36"/>
                 <w:sz w:val="18"/>
                 <w:szCs w:val="18"/>
               </w:rPr>
-              <w:t xml:space="preserve">–</w:t>
-            </w:r>
-            <w:r>
-              <w:rPr>
-                <w:rFonts w:ascii="Nunito Sans" w:cs="Nunito Sans" w:eastAsia="Nunito Sans" w:hAnsi="Nunito Sans"/>
+              <w:t>–</w:t>
+            </w:r>
+            <w:r>
+              <w:rPr>
+                <w:rFonts w:ascii="Nunito Sans" w:hAnsi="Nunito Sans" w:eastAsia="Nunito Sans" w:cs="Nunito Sans"/>
                 <w:b/>
                 <w:bCs/>
-                <w:i w:val="false"/>
-                <w:iCs w:val="false"/>
                 <w:color w:val="2E1015"/>
                 <w:sz w:val="18"/>
                 <w:szCs w:val="18"/>
                 <w:highlight w:val="yellow"/>
-                <w:highlightCs w:val="yellow"/>
-              </w:rPr>
-              <w:t xml:space="preserve">[TIME]</w:t>
-            </w:r>
-            <w:r>
-              <w:rPr>
-                <w:rFonts w:ascii="Nunito Sans" w:cs="Nunito Sans" w:eastAsia="Nunito Sans" w:hAnsi="Nunito Sans"/>
-                <w:b w:val="false"/>
-                <w:bCs w:val="false"/>
-                <w:i w:val="false"/>
-                <w:iCs w:val="false"/>
+              </w:rPr>
+              <w:t>[TIME]</w:t>
+            </w:r>
+            <w:r>
+              <w:rPr>
+                <w:rFonts w:ascii="Nunito Sans" w:hAnsi="Nunito Sans" w:eastAsia="Nunito Sans" w:cs="Nunito Sans"/>
                 <w:color w:val="4A3A36"/>
                 <w:sz w:val="18"/>
                 <w:szCs w:val="18"/>
@@ -570,18 +513,15 @@
             </w:r>
             <w:r>
               <w:rPr>
-                <w:rFonts w:ascii="Nunito Sans" w:cs="Nunito Sans" w:eastAsia="Nunito Sans" w:hAnsi="Nunito Sans"/>
+                <w:rFonts w:ascii="Nunito Sans" w:hAnsi="Nunito Sans" w:eastAsia="Nunito Sans" w:cs="Nunito Sans"/>
                 <w:b/>
                 <w:bCs/>
-                <w:i w:val="false"/>
-                <w:iCs w:val="false"/>
                 <w:color w:val="2E1015"/>
                 <w:sz w:val="18"/>
                 <w:szCs w:val="18"/>
                 <w:highlight w:val="yellow"/>
-                <w:highlightCs w:val="yellow"/>
-              </w:rPr>
-              <w:t xml:space="preserve">[DATE]</w:t>
+              </w:rPr>
+              <w:t>[DATE]</w:t>
             </w:r>
           </w:p>
         </w:tc>
@@ -592,18 +532,18 @@
         </w:trPr>
         <w:tc>
           <w:tcPr>
-            <w:tcW w:type="dxa" w:w="1157"/>
+            <w:tcW w:w="1157" w:type="dxa"/>
             <w:tcBorders>
-              <w:top w:val="single" w:color="DCCBA8" w:sz="4"/>
-              <w:left w:val="single" w:color="DCCBA8" w:sz="4"/>
-              <w:bottom w:val="single" w:color="DCCBA8" w:sz="4"/>
-              <w:right w:val="single" w:color="DCCBA8" w:sz="4"/>
+              <w:top w:val="single" w:sz="4" w:color="DCCBA8"/>
+              <w:left w:val="single" w:sz="4" w:color="DCCBA8"/>
+              <w:bottom w:val="single" w:sz="4" w:color="DCCBA8"/>
+              <w:right w:val="single" w:sz="4" w:color="DCCBA8"/>
             </w:tcBorders>
             <w:tcMar>
-              <w:top w:type="dxa" w:w="90"/>
-              <w:left w:type="dxa" w:w="110"/>
-              <w:bottom w:type="dxa" w:w="90"/>
-              <w:right w:type="dxa" w:w="110"/>
+              <w:top w:w="90" w:type="dxa"/>
+              <w:left w:w="110" w:type="dxa"/>
+              <w:bottom w:w="90" w:type="dxa"/>
+              <w:right w:w="110" w:type="dxa"/>
             </w:tcMar>
             <w:vAlign w:val="top"/>
           </w:tcPr>
@@ -613,33 +553,31 @@
             </w:pPr>
             <w:r>
               <w:rPr>
-                <w:rFonts w:ascii="Nunito Sans" w:cs="Nunito Sans" w:eastAsia="Nunito Sans" w:hAnsi="Nunito Sans"/>
+                <w:rFonts w:ascii="Nunito Sans" w:hAnsi="Nunito Sans" w:eastAsia="Nunito Sans" w:cs="Nunito Sans"/>
                 <w:b/>
                 <w:bCs/>
-                <w:i w:val="false"/>
-                <w:iCs w:val="false"/>
                 <w:color w:val="2E1015"/>
                 <w:sz w:val="18"/>
                 <w:szCs w:val="18"/>
               </w:rPr>
-              <w:t xml:space="preserve">Where</w:t>
+              <w:t>Where</w:t>
             </w:r>
           </w:p>
         </w:tc>
         <w:tc>
           <w:tcPr>
-            <w:tcW w:type="dxa" w:w="8481"/>
+            <w:tcW w:w="8481" w:type="dxa"/>
             <w:tcBorders>
-              <w:top w:val="single" w:color="DCCBA8" w:sz="4"/>
-              <w:left w:val="single" w:color="DCCBA8" w:sz="4"/>
-              <w:bottom w:val="single" w:color="DCCBA8" w:sz="4"/>
-              <w:right w:val="single" w:color="DCCBA8" w:sz="4"/>
+              <w:top w:val="single" w:sz="4" w:color="DCCBA8"/>
+              <w:left w:val="single" w:sz="4" w:color="DCCBA8"/>
+              <w:bottom w:val="single" w:sz="4" w:color="DCCBA8"/>
+              <w:right w:val="single" w:sz="4" w:color="DCCBA8"/>
             </w:tcBorders>
             <w:tcMar>
-              <w:top w:type="dxa" w:w="90"/>
-              <w:left w:type="dxa" w:w="110"/>
-              <w:bottom w:type="dxa" w:w="90"/>
-              <w:right w:type="dxa" w:w="110"/>
+              <w:top w:w="90" w:type="dxa"/>
+              <w:left w:w="110" w:type="dxa"/>
+              <w:bottom w:w="90" w:type="dxa"/>
+              <w:right w:w="110" w:type="dxa"/>
             </w:tcMar>
             <w:vAlign w:val="top"/>
           </w:tcPr>
@@ -649,18 +587,15 @@
             </w:pPr>
             <w:r>
               <w:rPr>
-                <w:rFonts w:ascii="Nunito Sans" w:cs="Nunito Sans" w:eastAsia="Nunito Sans" w:hAnsi="Nunito Sans"/>
+                <w:rFonts w:ascii="Nunito Sans" w:hAnsi="Nunito Sans" w:eastAsia="Nunito Sans" w:cs="Nunito Sans"/>
                 <w:b/>
                 <w:bCs/>
-                <w:i w:val="false"/>
-                <w:iCs w:val="false"/>
                 <w:color w:val="2E1015"/>
                 <w:sz w:val="18"/>
                 <w:szCs w:val="18"/>
                 <w:highlight w:val="yellow"/>
-                <w:highlightCs w:val="yellow"/>
-              </w:rPr>
-              <w:t xml:space="preserve">[VENUE AND ADDRESS]</w:t>
+              </w:rPr>
+              <w:t>[VENUE AND ADDRESS]</w:t>
             </w:r>
           </w:p>
         </w:tc>
@@ -671,18 +606,18 @@
         </w:trPr>
         <w:tc>
           <w:tcPr>
-            <w:tcW w:type="dxa" w:w="1157"/>
+            <w:tcW w:w="1157" w:type="dxa"/>
             <w:tcBorders>
-              <w:top w:val="single" w:color="DCCBA8" w:sz="4"/>
-              <w:left w:val="single" w:color="DCCBA8" w:sz="4"/>
-              <w:bottom w:val="single" w:color="DCCBA8" w:sz="4"/>
-              <w:right w:val="single" w:color="DCCBA8" w:sz="4"/>
+              <w:top w:val="single" w:sz="4" w:color="DCCBA8"/>
+              <w:left w:val="single" w:sz="4" w:color="DCCBA8"/>
+              <w:bottom w:val="single" w:sz="4" w:color="DCCBA8"/>
+              <w:right w:val="single" w:sz="4" w:color="DCCBA8"/>
             </w:tcBorders>
             <w:tcMar>
-              <w:top w:type="dxa" w:w="90"/>
-              <w:left w:type="dxa" w:w="110"/>
-              <w:bottom w:type="dxa" w:w="90"/>
-              <w:right w:type="dxa" w:w="110"/>
+              <w:top w:w="90" w:type="dxa"/>
+              <w:left w:w="110" w:type="dxa"/>
+              <w:bottom w:w="90" w:type="dxa"/>
+              <w:right w:w="110" w:type="dxa"/>
             </w:tcMar>
             <w:vAlign w:val="top"/>
           </w:tcPr>
@@ -692,33 +627,31 @@
             </w:pPr>
             <w:r>
               <w:rPr>
-                <w:rFonts w:ascii="Nunito Sans" w:cs="Nunito Sans" w:eastAsia="Nunito Sans" w:hAnsi="Nunito Sans"/>
+                <w:rFonts w:ascii="Nunito Sans" w:hAnsi="Nunito Sans" w:eastAsia="Nunito Sans" w:cs="Nunito Sans"/>
                 <w:b/>
                 <w:bCs/>
-                <w:i w:val="false"/>
-                <w:iCs w:val="false"/>
                 <w:color w:val="2E1015"/>
                 <w:sz w:val="18"/>
                 <w:szCs w:val="18"/>
               </w:rPr>
-              <w:t xml:space="preserve">How long</w:t>
+              <w:t>How long</w:t>
             </w:r>
           </w:p>
         </w:tc>
         <w:tc>
           <w:tcPr>
-            <w:tcW w:type="dxa" w:w="8481"/>
+            <w:tcW w:w="8481" w:type="dxa"/>
             <w:tcBorders>
-              <w:top w:val="single" w:color="DCCBA8" w:sz="4"/>
-              <w:left w:val="single" w:color="DCCBA8" w:sz="4"/>
-              <w:bottom w:val="single" w:color="DCCBA8" w:sz="4"/>
-              <w:right w:val="single" w:color="DCCBA8" w:sz="4"/>
+              <w:top w:val="single" w:sz="4" w:color="DCCBA8"/>
+              <w:left w:val="single" w:sz="4" w:color="DCCBA8"/>
+              <w:bottom w:val="single" w:sz="4" w:color="DCCBA8"/>
+              <w:right w:val="single" w:sz="4" w:color="DCCBA8"/>
             </w:tcBorders>
             <w:tcMar>
-              <w:top w:type="dxa" w:w="90"/>
-              <w:left w:type="dxa" w:w="110"/>
-              <w:bottom w:type="dxa" w:w="90"/>
-              <w:right w:type="dxa" w:w="110"/>
+              <w:top w:w="90" w:type="dxa"/>
+              <w:left w:w="110" w:type="dxa"/>
+              <w:bottom w:w="90" w:type="dxa"/>
+              <w:right w:w="110" w:type="dxa"/>
             </w:tcMar>
             <w:vAlign w:val="top"/>
           </w:tcPr>
@@ -728,16 +661,12 @@
             </w:pPr>
             <w:r>
               <w:rPr>
-                <w:rFonts w:ascii="Nunito Sans" w:cs="Nunito Sans" w:eastAsia="Nunito Sans" w:hAnsi="Nunito Sans"/>
-                <w:b w:val="false"/>
-                <w:bCs w:val="false"/>
-                <w:i w:val="false"/>
-                <w:iCs w:val="false"/>
+                <w:rFonts w:ascii="Nunito Sans" w:hAnsi="Nunito Sans" w:eastAsia="Nunito Sans" w:cs="Nunito Sans"/>
                 <w:color w:val="4A3A36"/>
                 <w:sz w:val="18"/>
                 <w:szCs w:val="18"/>
               </w:rPr>
-              <w:t xml:space="preserve">8 weekly sessions of 90 minutes</w:t>
+              <w:t>8 weekly sessions of 90 minutes</w:t>
             </w:r>
           </w:p>
         </w:tc>
@@ -748,18 +677,18 @@
         </w:trPr>
         <w:tc>
           <w:tcPr>
-            <w:tcW w:type="dxa" w:w="1157"/>
+            <w:tcW w:w="1157" w:type="dxa"/>
             <w:tcBorders>
-              <w:top w:val="single" w:color="DCCBA8" w:sz="4"/>
-              <w:left w:val="single" w:color="DCCBA8" w:sz="4"/>
-              <w:bottom w:val="single" w:color="DCCBA8" w:sz="4"/>
-              <w:right w:val="single" w:color="DCCBA8" w:sz="4"/>
+              <w:top w:val="single" w:sz="4" w:color="DCCBA8"/>
+              <w:left w:val="single" w:sz="4" w:color="DCCBA8"/>
+              <w:bottom w:val="single" w:sz="4" w:color="DCCBA8"/>
+              <w:right w:val="single" w:sz="4" w:color="DCCBA8"/>
             </w:tcBorders>
             <w:tcMar>
-              <w:top w:type="dxa" w:w="90"/>
-              <w:left w:type="dxa" w:w="110"/>
-              <w:bottom w:type="dxa" w:w="90"/>
-              <w:right w:type="dxa" w:w="110"/>
+              <w:top w:w="90" w:type="dxa"/>
+              <w:left w:w="110" w:type="dxa"/>
+              <w:bottom w:w="90" w:type="dxa"/>
+              <w:right w:w="110" w:type="dxa"/>
             </w:tcMar>
             <w:vAlign w:val="top"/>
           </w:tcPr>
@@ -769,33 +698,31 @@
             </w:pPr>
             <w:r>
               <w:rPr>
-                <w:rFonts w:ascii="Nunito Sans" w:cs="Nunito Sans" w:eastAsia="Nunito Sans" w:hAnsi="Nunito Sans"/>
+                <w:rFonts w:ascii="Nunito Sans" w:hAnsi="Nunito Sans" w:eastAsia="Nunito Sans" w:cs="Nunito Sans"/>
                 <w:b/>
                 <w:bCs/>
-                <w:i w:val="false"/>
-                <w:iCs w:val="false"/>
                 <w:color w:val="2E1015"/>
                 <w:sz w:val="18"/>
                 <w:szCs w:val="18"/>
               </w:rPr>
-              <w:t xml:space="preserve">Cost</w:t>
+              <w:t>Cost</w:t>
             </w:r>
           </w:p>
         </w:tc>
         <w:tc>
           <w:tcPr>
-            <w:tcW w:type="dxa" w:w="8481"/>
+            <w:tcW w:w="8481" w:type="dxa"/>
             <w:tcBorders>
-              <w:top w:val="single" w:color="DCCBA8" w:sz="4"/>
-              <w:left w:val="single" w:color="DCCBA8" w:sz="4"/>
-              <w:bottom w:val="single" w:color="DCCBA8" w:sz="4"/>
-              <w:right w:val="single" w:color="DCCBA8" w:sz="4"/>
+              <w:top w:val="single" w:sz="4" w:color="DCCBA8"/>
+              <w:left w:val="single" w:sz="4" w:color="DCCBA8"/>
+              <w:bottom w:val="single" w:sz="4" w:color="DCCBA8"/>
+              <w:right w:val="single" w:sz="4" w:color="DCCBA8"/>
             </w:tcBorders>
             <w:tcMar>
-              <w:top w:type="dxa" w:w="90"/>
-              <w:left w:type="dxa" w:w="110"/>
-              <w:bottom w:type="dxa" w:w="90"/>
-              <w:right w:type="dxa" w:w="110"/>
+              <w:top w:w="90" w:type="dxa"/>
+              <w:left w:w="110" w:type="dxa"/>
+              <w:bottom w:w="90" w:type="dxa"/>
+              <w:right w:w="110" w:type="dxa"/>
             </w:tcMar>
             <w:vAlign w:val="top"/>
           </w:tcPr>
@@ -805,24 +732,18 @@
             </w:pPr>
             <w:r>
               <w:rPr>
-                <w:rFonts w:ascii="Nunito Sans" w:cs="Nunito Sans" w:eastAsia="Nunito Sans" w:hAnsi="Nunito Sans"/>
+                <w:rFonts w:ascii="Nunito Sans" w:hAnsi="Nunito Sans" w:eastAsia="Nunito Sans" w:cs="Nunito Sans"/>
                 <w:b/>
                 <w:bCs/>
-                <w:i w:val="false"/>
-                <w:iCs w:val="false"/>
                 <w:color w:val="4A3A36"/>
                 <w:sz w:val="18"/>
                 <w:szCs w:val="18"/>
               </w:rPr>
-              <w:t xml:space="preserve">$40 for the whole term</w:t>
-            </w:r>
-            <w:r>
-              <w:rPr>
-                <w:rFonts w:ascii="Nunito Sans" w:cs="Nunito Sans" w:eastAsia="Nunito Sans" w:hAnsi="Nunito Sans"/>
-                <w:b w:val="false"/>
-                <w:bCs w:val="false"/>
-                <w:i w:val="false"/>
-                <w:iCs w:val="false"/>
+              <w:t>$40 for the whole term</w:t>
+            </w:r>
+            <w:r>
+              <w:rPr>
+                <w:rFonts w:ascii="Nunito Sans" w:hAnsi="Nunito Sans" w:eastAsia="Nunito Sans" w:cs="Nunito Sans"/>
                 <w:color w:val="4A3A36"/>
                 <w:sz w:val="18"/>
                 <w:szCs w:val="18"/>
@@ -838,18 +759,18 @@
         </w:trPr>
         <w:tc>
           <w:tcPr>
-            <w:tcW w:type="dxa" w:w="1157"/>
+            <w:tcW w:w="1157" w:type="dxa"/>
             <w:tcBorders>
-              <w:top w:val="single" w:color="DCCBA8" w:sz="4"/>
-              <w:left w:val="single" w:color="DCCBA8" w:sz="4"/>
-              <w:bottom w:val="single" w:color="DCCBA8" w:sz="4"/>
-              <w:right w:val="single" w:color="DCCBA8" w:sz="4"/>
+              <w:top w:val="single" w:sz="4" w:color="DCCBA8"/>
+              <w:left w:val="single" w:sz="4" w:color="DCCBA8"/>
+              <w:bottom w:val="single" w:sz="4" w:color="DCCBA8"/>
+              <w:right w:val="single" w:sz="4" w:color="DCCBA8"/>
             </w:tcBorders>
             <w:tcMar>
-              <w:top w:type="dxa" w:w="90"/>
-              <w:left w:type="dxa" w:w="110"/>
-              <w:bottom w:type="dxa" w:w="90"/>
-              <w:right w:type="dxa" w:w="110"/>
+              <w:top w:w="90" w:type="dxa"/>
+              <w:left w:w="110" w:type="dxa"/>
+              <w:bottom w:w="90" w:type="dxa"/>
+              <w:right w:w="110" w:type="dxa"/>
             </w:tcMar>
             <w:vAlign w:val="top"/>
           </w:tcPr>
@@ -859,33 +780,31 @@
             </w:pPr>
             <w:r>
               <w:rPr>
-                <w:rFonts w:ascii="Nunito Sans" w:cs="Nunito Sans" w:eastAsia="Nunito Sans" w:hAnsi="Nunito Sans"/>
+                <w:rFonts w:ascii="Nunito Sans" w:hAnsi="Nunito Sans" w:eastAsia="Nunito Sans" w:cs="Nunito Sans"/>
                 <w:b/>
                 <w:bCs/>
-                <w:i w:val="false"/>
-                <w:iCs w:val="false"/>
                 <w:color w:val="2E1015"/>
                 <w:sz w:val="18"/>
                 <w:szCs w:val="18"/>
               </w:rPr>
-              <w:t xml:space="preserve">Class size</w:t>
+              <w:t>Class size</w:t>
             </w:r>
           </w:p>
         </w:tc>
         <w:tc>
           <w:tcPr>
-            <w:tcW w:type="dxa" w:w="8481"/>
+            <w:tcW w:w="8481" w:type="dxa"/>
             <w:tcBorders>
-              <w:top w:val="single" w:color="DCCBA8" w:sz="4"/>
-              <w:left w:val="single" w:color="DCCBA8" w:sz="4"/>
-              <w:bottom w:val="single" w:color="DCCBA8" w:sz="4"/>
-              <w:right w:val="single" w:color="DCCBA8" w:sz="4"/>
+              <w:top w:val="single" w:sz="4" w:color="DCCBA8"/>
+              <w:left w:val="single" w:sz="4" w:color="DCCBA8"/>
+              <w:bottom w:val="single" w:sz="4" w:color="DCCBA8"/>
+              <w:right w:val="single" w:sz="4" w:color="DCCBA8"/>
             </w:tcBorders>
             <w:tcMar>
-              <w:top w:type="dxa" w:w="90"/>
-              <w:left w:type="dxa" w:w="110"/>
-              <w:bottom w:type="dxa" w:w="90"/>
-              <w:right w:type="dxa" w:w="110"/>
+              <w:top w:w="90" w:type="dxa"/>
+              <w:left w:w="110" w:type="dxa"/>
+              <w:bottom w:w="90" w:type="dxa"/>
+              <w:right w:w="110" w:type="dxa"/>
             </w:tcMar>
             <w:vAlign w:val="top"/>
           </w:tcPr>
@@ -895,26 +814,19 @@
             </w:pPr>
             <w:r>
               <w:rPr>
-                <w:rFonts w:ascii="Nunito Sans" w:cs="Nunito Sans" w:eastAsia="Nunito Sans" w:hAnsi="Nunito Sans"/>
+                <w:rFonts w:ascii="Nunito Sans" w:hAnsi="Nunito Sans" w:eastAsia="Nunito Sans" w:cs="Nunito Sans"/>
                 <w:b/>
                 <w:bCs/>
-                <w:i w:val="false"/>
-                <w:iCs w:val="false"/>
                 <w:color w:val="2E1015"/>
                 <w:sz w:val="18"/>
                 <w:szCs w:val="18"/>
                 <w:highlight w:val="yellow"/>
-                <w:highlightCs w:val="yellow"/>
-              </w:rPr>
-              <w:t xml:space="preserve">[N]</w:t>
-            </w:r>
-            <w:r>
-              <w:rPr>
-                <w:rFonts w:ascii="Nunito Sans" w:cs="Nunito Sans" w:eastAsia="Nunito Sans" w:hAnsi="Nunito Sans"/>
-                <w:b w:val="false"/>
-                <w:bCs w:val="false"/>
-                <w:i w:val="false"/>
-                <w:iCs w:val="false"/>
+              </w:rPr>
+              <w:t>[N]</w:t>
+            </w:r>
+            <w:r>
+              <w:rPr>
+                <w:rFonts w:ascii="Nunito Sans" w:hAnsi="Nunito Sans" w:eastAsia="Nunito Sans" w:cs="Nunito Sans"/>
                 <w:color w:val="4A3A36"/>
                 <w:sz w:val="18"/>
                 <w:szCs w:val="18"/>
@@ -930,18 +842,18 @@
         </w:trPr>
         <w:tc>
           <w:tcPr>
-            <w:tcW w:type="dxa" w:w="1157"/>
+            <w:tcW w:w="1157" w:type="dxa"/>
             <w:tcBorders>
-              <w:top w:val="single" w:color="DCCBA8" w:sz="4"/>
-              <w:left w:val="single" w:color="DCCBA8" w:sz="4"/>
-              <w:bottom w:val="single" w:color="DCCBA8" w:sz="4"/>
-              <w:right w:val="single" w:color="DCCBA8" w:sz="4"/>
+              <w:top w:val="single" w:sz="4" w:color="DCCBA8"/>
+              <w:left w:val="single" w:sz="4" w:color="DCCBA8"/>
+              <w:bottom w:val="single" w:sz="4" w:color="DCCBA8"/>
+              <w:right w:val="single" w:sz="4" w:color="DCCBA8"/>
             </w:tcBorders>
             <w:tcMar>
-              <w:top w:type="dxa" w:w="90"/>
-              <w:left w:type="dxa" w:w="110"/>
-              <w:bottom w:type="dxa" w:w="90"/>
-              <w:right w:type="dxa" w:w="110"/>
+              <w:top w:w="90" w:type="dxa"/>
+              <w:left w:w="110" w:type="dxa"/>
+              <w:bottom w:w="90" w:type="dxa"/>
+              <w:right w:w="110" w:type="dxa"/>
             </w:tcMar>
             <w:vAlign w:val="top"/>
           </w:tcPr>
@@ -951,33 +863,31 @@
             </w:pPr>
             <w:r>
               <w:rPr>
-                <w:rFonts w:ascii="Nunito Sans" w:cs="Nunito Sans" w:eastAsia="Nunito Sans" w:hAnsi="Nunito Sans"/>
+                <w:rFonts w:ascii="Nunito Sans" w:hAnsi="Nunito Sans" w:eastAsia="Nunito Sans" w:cs="Nunito Sans"/>
                 <w:b/>
                 <w:bCs/>
-                <w:i w:val="false"/>
-                <w:iCs w:val="false"/>
                 <w:color w:val="2E1015"/>
                 <w:sz w:val="18"/>
                 <w:szCs w:val="18"/>
               </w:rPr>
-              <w:t xml:space="preserve">Last session</w:t>
+              <w:t>Last session</w:t>
             </w:r>
           </w:p>
         </w:tc>
         <w:tc>
           <w:tcPr>
-            <w:tcW w:type="dxa" w:w="8481"/>
+            <w:tcW w:w="8481" w:type="dxa"/>
             <w:tcBorders>
-              <w:top w:val="single" w:color="DCCBA8" w:sz="4"/>
-              <w:left w:val="single" w:color="DCCBA8" w:sz="4"/>
-              <w:bottom w:val="single" w:color="DCCBA8" w:sz="4"/>
-              <w:right w:val="single" w:color="DCCBA8" w:sz="4"/>
+              <w:top w:val="single" w:sz="4" w:color="DCCBA8"/>
+              <w:left w:val="single" w:sz="4" w:color="DCCBA8"/>
+              <w:bottom w:val="single" w:sz="4" w:color="DCCBA8"/>
+              <w:right w:val="single" w:sz="4" w:color="DCCBA8"/>
             </w:tcBorders>
             <w:tcMar>
-              <w:top w:type="dxa" w:w="90"/>
-              <w:left w:type="dxa" w:w="110"/>
-              <w:bottom w:type="dxa" w:w="90"/>
-              <w:right w:type="dxa" w:w="110"/>
+              <w:top w:w="90" w:type="dxa"/>
+              <w:left w:w="110" w:type="dxa"/>
+              <w:bottom w:w="90" w:type="dxa"/>
+              <w:right w:w="110" w:type="dxa"/>
             </w:tcMar>
             <w:vAlign w:val="top"/>
           </w:tcPr>
@@ -987,26 +897,19 @@
             </w:pPr>
             <w:r>
               <w:rPr>
-                <w:rFonts w:ascii="Nunito Sans" w:cs="Nunito Sans" w:eastAsia="Nunito Sans" w:hAnsi="Nunito Sans"/>
+                <w:rFonts w:ascii="Nunito Sans" w:hAnsi="Nunito Sans" w:eastAsia="Nunito Sans" w:cs="Nunito Sans"/>
                 <w:b/>
                 <w:bCs/>
-                <w:i w:val="false"/>
-                <w:iCs w:val="false"/>
                 <w:color w:val="2E1015"/>
                 <w:sz w:val="18"/>
                 <w:szCs w:val="18"/>
                 <w:highlight w:val="yellow"/>
-                <w:highlightCs w:val="yellow"/>
-              </w:rPr>
-              <w:t xml:space="preserve">[DATE]</w:t>
-            </w:r>
-            <w:r>
-              <w:rPr>
-                <w:rFonts w:ascii="Nunito Sans" w:cs="Nunito Sans" w:eastAsia="Nunito Sans" w:hAnsi="Nunito Sans"/>
-                <w:b w:val="false"/>
-                <w:bCs w:val="false"/>
-                <w:i w:val="false"/>
-                <w:iCs w:val="false"/>
+              </w:rPr>
+              <w:t>[DATE]</w:t>
+            </w:r>
+            <w:r>
+              <w:rPr>
+                <w:rFonts w:ascii="Nunito Sans" w:hAnsi="Nunito Sans" w:eastAsia="Nunito Sans" w:cs="Nunito Sans"/>
                 <w:color w:val="4A3A36"/>
                 <w:sz w:val="18"/>
                 <w:szCs w:val="18"/>
@@ -1015,16 +918,14 @@
             </w:r>
             <w:r>
               <w:rPr>
-                <w:rFonts w:ascii="Nunito Sans" w:cs="Nunito Sans" w:eastAsia="Nunito Sans" w:hAnsi="Nunito Sans"/>
+                <w:rFonts w:ascii="Nunito Sans" w:hAnsi="Nunito Sans" w:eastAsia="Nunito Sans" w:cs="Nunito Sans"/>
                 <w:b/>
                 <w:bCs/>
-                <w:i w:val="false"/>
-                <w:iCs w:val="false"/>
                 <w:color w:val="4A3A36"/>
                 <w:sz w:val="18"/>
                 <w:szCs w:val="18"/>
               </w:rPr>
-              <w:t xml:space="preserve">Please come.</w:t>
+              <w:t>Please come.</w:t>
             </w:r>
           </w:p>
         </w:tc>
@@ -1039,20 +940,18 @@
       <w:pPr>
         <w:pStyle w:val="Heading3"/>
         <w:keepNext/>
-        <w:spacing w:after="80" w:before="260"/>
-      </w:pPr>
-      <w:r>
-        <w:rPr>
-          <w:rFonts w:ascii="Fredoka" w:cs="Fredoka" w:eastAsia="Fredoka" w:hAnsi="Fredoka"/>
-          <w:b/>
-          <w:bCs/>
-          <w:i w:val="false"/>
-          <w:iCs w:val="false"/>
+        <w:spacing w:before="260" w:after="80"/>
+      </w:pPr>
+      <w:r>
+        <w:rPr>
+          <w:rFonts w:ascii="Fredoka" w:hAnsi="Fredoka" w:eastAsia="Fredoka" w:cs="Fredoka"/>
+          <w:b/>
+          <w:bCs/>
           <w:color w:val="2E1015"/>
           <w:sz w:val="23"/>
           <w:szCs w:val="23"/>
         </w:rPr>
-        <w:t xml:space="preserve">What we use</w:t>
+        <w:t>What we use</w:t>
       </w:r>
     </w:p>
     <w:p>
@@ -1061,45 +960,33 @@
       </w:pPr>
       <w:r>
         <w:rPr>
-          <w:rFonts w:ascii="Nunito Sans" w:cs="Nunito Sans" w:eastAsia="Nunito Sans" w:hAnsi="Nunito Sans"/>
-          <w:b w:val="false"/>
-          <w:bCs w:val="false"/>
-          <w:i w:val="false"/>
-          <w:iCs w:val="false"/>
+          <w:rFonts w:ascii="Nunito Sans" w:hAnsi="Nunito Sans" w:eastAsia="Nunito Sans" w:cs="Nunito Sans"/>
           <w:color w:val="4A3A36"/>
           <w:sz w:val="20"/>
           <w:szCs w:val="20"/>
         </w:rPr>
         <w:t xml:space="preserve">We teach with </w:t>
       </w:r>
-      <w:hyperlink w:history="1" r:id="rIdmbnqehmgyxctg9x_vwpl1">
+      <w:hyperlink r:id="rIdmbnqehmgyxctg9x_vwpl1">
         <w:r>
           <w:rPr>
-            <w:rFonts w:ascii="Nunito Sans" w:cs="Nunito Sans" w:eastAsia="Nunito Sans" w:hAnsi="Nunito Sans"/>
-            <w:b w:val="false"/>
-            <w:bCs w:val="false"/>
-            <w:i w:val="false"/>
-            <w:iCs w:val="false"/>
+            <w:rFonts w:ascii="Nunito Sans" w:hAnsi="Nunito Sans" w:eastAsia="Nunito Sans" w:cs="Nunito Sans"/>
             <w:color w:val="2E6B3A"/>
             <w:sz w:val="20"/>
             <w:szCs w:val="20"/>
             <w:u w:val="single"/>
           </w:rPr>
-          <w:t xml:space="preserve">Scratch</w:t>
+          <w:t>Scratch</w:t>
         </w:r>
       </w:hyperlink>
       <w:r>
         <w:rPr>
-          <w:rFonts w:ascii="Nunito Sans" w:cs="Nunito Sans" w:eastAsia="Nunito Sans" w:hAnsi="Nunito Sans"/>
-          <w:b w:val="false"/>
-          <w:bCs w:val="false"/>
-          <w:i w:val="false"/>
-          <w:iCs w:val="false"/>
-          <w:color w:val="4A3A36"/>
-          <w:sz w:val="20"/>
-          <w:szCs w:val="20"/>
-        </w:rPr>
-        <w:t xml:space="preserve">, a free visual programming language made by MIT and used in schools around the world. Children snap coloured blocks together instead of typing code, which means they spend their time thinking about ideas rather than fighting with punctuation. It runs in a web browser and it's completely free.</w:t>
+          <w:rFonts w:ascii="Nunito Sans" w:hAnsi="Nunito Sans" w:eastAsia="Nunito Sans" w:cs="Nunito Sans"/>
+          <w:color w:val="4A3A36"/>
+          <w:sz w:val="20"/>
+          <w:szCs w:val="20"/>
+        </w:rPr>
+        <w:t>, a free visual programming language made by MIT and used in schools around the world. Children snap coloured blocks together instead of typing code, which means they spend their time thinking about ideas rather than fighting with punctuation. It runs in a web browser and it's completely free.</w:t>
       </w:r>
     </w:p>
     <w:p>
@@ -1108,36 +995,30 @@
       </w:pPr>
       <w:r>
         <w:rPr>
-          <w:rFonts w:ascii="Nunito Sans" w:cs="Nunito Sans" w:eastAsia="Nunito Sans" w:hAnsi="Nunito Sans"/>
-          <w:b w:val="false"/>
-          <w:bCs w:val="false"/>
-          <w:i w:val="false"/>
-          <w:iCs w:val="false"/>
-          <w:color w:val="4A3A36"/>
-          <w:sz w:val="20"/>
-          <w:szCs w:val="20"/>
-        </w:rPr>
-        <w:t xml:space="preserve">We'll create a Scratch account for your child through a club teacher account. We'll cover online safety in class, and we ask the children not to put personal details in their projects. Their work will be saved online so they can carry on at home.</w:t>
+          <w:rFonts w:ascii="Nunito Sans" w:hAnsi="Nunito Sans" w:eastAsia="Nunito Sans" w:cs="Nunito Sans"/>
+          <w:color w:val="4A3A36"/>
+          <w:sz w:val="20"/>
+          <w:szCs w:val="20"/>
+        </w:rPr>
+        <w:t>We'll create a Scratch account for your child through a club teacher account. We'll cover online safety in class, and we ask the children not to put personal details in their projects. Their work will be saved online so they can carry on at home.</w:t>
       </w:r>
     </w:p>
     <w:p>
       <w:pPr>
         <w:pStyle w:val="Heading3"/>
         <w:keepNext/>
-        <w:spacing w:after="80" w:before="260"/>
-      </w:pPr>
-      <w:r>
-        <w:rPr>
-          <w:rFonts w:ascii="Fredoka" w:cs="Fredoka" w:eastAsia="Fredoka" w:hAnsi="Fredoka"/>
-          <w:b/>
-          <w:bCs/>
-          <w:i w:val="false"/>
-          <w:iCs w:val="false"/>
+        <w:spacing w:before="260" w:after="80"/>
+      </w:pPr>
+      <w:r>
+        <w:rPr>
+          <w:rFonts w:ascii="Fredoka" w:hAnsi="Fredoka" w:eastAsia="Fredoka" w:cs="Fredoka"/>
+          <w:b/>
+          <w:bCs/>
           <w:color w:val="2E1015"/>
           <w:sz w:val="23"/>
           <w:szCs w:val="23"/>
         </w:rPr>
-        <w:t xml:space="preserve">What your child needs to bring</w:t>
+        <w:t>What your child needs to bring</w:t>
       </w:r>
     </w:p>
     <w:p>
@@ -1147,7 +1028,7 @@
       </w:pPr>
       <w:r>
         <w:rPr>
-          <w:rFonts w:ascii="Nunito Sans" w:cs="Nunito Sans" w:eastAsia="Nunito Sans" w:hAnsi="Nunito Sans"/>
+          <w:rFonts w:ascii="Nunito Sans" w:hAnsi="Nunito Sans" w:eastAsia="Nunito Sans" w:cs="Nunito Sans"/>
           <w:b/>
           <w:bCs/>
           <w:color w:val="8C2332"/>
@@ -1158,24 +1039,18 @@
       </w:r>
       <w:r>
         <w:rPr>
-          <w:rFonts w:ascii="Nunito Sans" w:cs="Nunito Sans" w:eastAsia="Nunito Sans" w:hAnsi="Nunito Sans"/>
-          <w:b/>
-          <w:bCs/>
-          <w:i w:val="false"/>
-          <w:iCs w:val="false"/>
-          <w:color w:val="4A3A36"/>
-          <w:sz w:val="20"/>
-          <w:szCs w:val="20"/>
-        </w:rPr>
-        <w:t xml:space="preserve">A laptop.</w:t>
-      </w:r>
-      <w:r>
-        <w:rPr>
-          <w:rFonts w:ascii="Nunito Sans" w:cs="Nunito Sans" w:eastAsia="Nunito Sans" w:hAnsi="Nunito Sans"/>
-          <w:b w:val="false"/>
-          <w:bCs w:val="false"/>
-          <w:i w:val="false"/>
-          <w:iCs w:val="false"/>
+          <w:rFonts w:ascii="Nunito Sans" w:hAnsi="Nunito Sans" w:eastAsia="Nunito Sans" w:cs="Nunito Sans"/>
+          <w:b/>
+          <w:bCs/>
+          <w:color w:val="4A3A36"/>
+          <w:sz w:val="20"/>
+          <w:szCs w:val="20"/>
+        </w:rPr>
+        <w:t>A laptop.</w:t>
+      </w:r>
+      <w:r>
+        <w:rPr>
+          <w:rFonts w:ascii="Nunito Sans" w:hAnsi="Nunito Sans" w:eastAsia="Nunito Sans" w:cs="Nunito Sans"/>
           <w:color w:val="4A3A36"/>
           <w:sz w:val="20"/>
           <w:szCs w:val="20"/>
@@ -1190,7 +1065,7 @@
       </w:pPr>
       <w:r>
         <w:rPr>
-          <w:rFonts w:ascii="Nunito Sans" w:cs="Nunito Sans" w:eastAsia="Nunito Sans" w:hAnsi="Nunito Sans"/>
+          <w:rFonts w:ascii="Nunito Sans" w:hAnsi="Nunito Sans" w:eastAsia="Nunito Sans" w:cs="Nunito Sans"/>
           <w:b/>
           <w:bCs/>
           <w:color w:val="8C2332"/>
@@ -1201,16 +1076,12 @@
       </w:r>
       <w:r>
         <w:rPr>
-          <w:rFonts w:ascii="Nunito Sans" w:cs="Nunito Sans" w:eastAsia="Nunito Sans" w:hAnsi="Nunito Sans"/>
-          <w:b w:val="false"/>
-          <w:bCs w:val="false"/>
-          <w:i w:val="false"/>
-          <w:iCs w:val="false"/>
-          <w:color w:val="4A3A36"/>
-          <w:sz w:val="20"/>
-          <w:szCs w:val="20"/>
-        </w:rPr>
-        <w:t xml:space="preserve">Headphones, if they have some. Not essential.</w:t>
+          <w:rFonts w:ascii="Nunito Sans" w:hAnsi="Nunito Sans" w:eastAsia="Nunito Sans" w:cs="Nunito Sans"/>
+          <w:color w:val="4A3A36"/>
+          <w:sz w:val="20"/>
+          <w:szCs w:val="20"/>
+        </w:rPr>
+        <w:t>Headphones, if they have some. Not essential.</w:t>
       </w:r>
     </w:p>
     <w:p>
@@ -1220,7 +1091,7 @@
       </w:pPr>
       <w:r>
         <w:rPr>
-          <w:rFonts w:ascii="Nunito Sans" w:cs="Nunito Sans" w:eastAsia="Nunito Sans" w:hAnsi="Nunito Sans"/>
+          <w:rFonts w:ascii="Nunito Sans" w:hAnsi="Nunito Sans" w:eastAsia="Nunito Sans" w:cs="Nunito Sans"/>
           <w:b/>
           <w:bCs/>
           <w:color w:val="8C2332"/>
@@ -1231,16 +1102,12 @@
       </w:r>
       <w:r>
         <w:rPr>
-          <w:rFonts w:ascii="Nunito Sans" w:cs="Nunito Sans" w:eastAsia="Nunito Sans" w:hAnsi="Nunito Sans"/>
-          <w:b w:val="false"/>
-          <w:bCs w:val="false"/>
-          <w:i w:val="false"/>
-          <w:iCs w:val="false"/>
-          <w:color w:val="4A3A36"/>
-          <w:sz w:val="20"/>
-          <w:szCs w:val="20"/>
-        </w:rPr>
-        <w:t xml:space="preserve">That's it. No books, nothing to install, nothing more to pay.</w:t>
+          <w:rFonts w:ascii="Nunito Sans" w:hAnsi="Nunito Sans" w:eastAsia="Nunito Sans" w:cs="Nunito Sans"/>
+          <w:color w:val="4A3A36"/>
+          <w:sz w:val="20"/>
+          <w:szCs w:val="20"/>
+        </w:rPr>
+        <w:t>That's it. No books, nothing more to pay.</w:t>
       </w:r>
     </w:p>
     <w:p>
@@ -1249,11 +1116,7 @@
       </w:pPr>
       <w:r>
         <w:rPr>
-          <w:rFonts w:ascii="Nunito Sans" w:cs="Nunito Sans" w:eastAsia="Nunito Sans" w:hAnsi="Nunito Sans"/>
-          <w:b w:val="false"/>
-          <w:bCs w:val="false"/>
-          <w:i w:val="false"/>
-          <w:iCs w:val="false"/>
+          <w:rFonts w:ascii="Nunito Sans" w:hAnsi="Nunito Sans" w:eastAsia="Nunito Sans" w:cs="Nunito Sans"/>
           <w:color w:val="4A3A36"/>
           <w:sz w:val="20"/>
           <w:szCs w:val="20"/>
@@ -1262,49 +1125,41 @@
       </w:r>
       <w:r>
         <w:rPr>
-          <w:rFonts w:ascii="Nunito Sans" w:cs="Nunito Sans" w:eastAsia="Nunito Sans" w:hAnsi="Nunito Sans"/>
-          <w:b/>
-          <w:bCs/>
-          <w:i w:val="false"/>
-          <w:iCs w:val="false"/>
-          <w:color w:val="4A3A36"/>
-          <w:sz w:val="20"/>
-          <w:szCs w:val="20"/>
-        </w:rPr>
-        <w:t xml:space="preserve">please tell us anyway</w:t>
-      </w:r>
-      <w:r>
-        <w:rPr>
-          <w:rFonts w:ascii="Nunito Sans" w:cs="Nunito Sans" w:eastAsia="Nunito Sans" w:hAnsi="Nunito Sans"/>
-          <w:b w:val="false"/>
-          <w:bCs w:val="false"/>
-          <w:i w:val="false"/>
-          <w:iCs w:val="false"/>
-          <w:color w:val="4A3A36"/>
-          <w:sz w:val="20"/>
-          <w:szCs w:val="20"/>
-        </w:rPr>
-        <w:t xml:space="preserve">. We can't promise anything, but we would much rather know and try to help than have you quietly not come.</w:t>
+          <w:rFonts w:ascii="Nunito Sans" w:hAnsi="Nunito Sans" w:eastAsia="Nunito Sans" w:cs="Nunito Sans"/>
+          <w:b/>
+          <w:bCs/>
+          <w:color w:val="4A3A36"/>
+          <w:sz w:val="20"/>
+          <w:szCs w:val="20"/>
+        </w:rPr>
+        <w:t>please tell us anyway</w:t>
+      </w:r>
+      <w:r>
+        <w:rPr>
+          <w:rFonts w:ascii="Nunito Sans" w:hAnsi="Nunito Sans" w:eastAsia="Nunito Sans" w:cs="Nunito Sans"/>
+          <w:color w:val="4A3A36"/>
+          <w:sz w:val="20"/>
+          <w:szCs w:val="20"/>
+        </w:rPr>
+        <w:t>. We can't promise anything, but we would much rather know and try to help than have you quietly not come.</w:t>
       </w:r>
     </w:p>
     <w:p>
       <w:pPr>
         <w:pStyle w:val="Heading3"/>
         <w:keepNext/>
-        <w:spacing w:after="80" w:before="260"/>
-      </w:pPr>
-      <w:r>
-        <w:rPr>
-          <w:rFonts w:ascii="Fredoka" w:cs="Fredoka" w:eastAsia="Fredoka" w:hAnsi="Fredoka"/>
-          <w:b/>
-          <w:bCs/>
-          <w:i w:val="false"/>
-          <w:iCs w:val="false"/>
+        <w:spacing w:before="260" w:after="80"/>
+      </w:pPr>
+      <w:r>
+        <w:rPr>
+          <w:rFonts w:ascii="Fredoka" w:hAnsi="Fredoka" w:eastAsia="Fredoka" w:cs="Fredoka"/>
+          <w:b/>
+          <w:bCs/>
           <w:color w:val="2E1015"/>
           <w:sz w:val="23"/>
           <w:szCs w:val="23"/>
         </w:rPr>
-        <w:t xml:space="preserve">What we'd love from you</w:t>
+        <w:t>What we'd love from you</w:t>
       </w:r>
     </w:p>
     <w:p>
@@ -1313,24 +1168,18 @@
       </w:pPr>
       <w:r>
         <w:rPr>
-          <w:rFonts w:ascii="Nunito Sans" w:cs="Nunito Sans" w:eastAsia="Nunito Sans" w:hAnsi="Nunito Sans"/>
-          <w:b/>
-          <w:bCs/>
-          <w:i w:val="false"/>
-          <w:iCs w:val="false"/>
-          <w:color w:val="4A3A36"/>
-          <w:sz w:val="20"/>
-          <w:szCs w:val="20"/>
-        </w:rPr>
-        <w:t xml:space="preserve">Ask them about it.</w:t>
-      </w:r>
-      <w:r>
-        <w:rPr>
-          <w:rFonts w:ascii="Nunito Sans" w:cs="Nunito Sans" w:eastAsia="Nunito Sans" w:hAnsi="Nunito Sans"/>
-          <w:b w:val="false"/>
-          <w:bCs w:val="false"/>
-          <w:i w:val="false"/>
-          <w:iCs w:val="false"/>
+          <w:rFonts w:ascii="Nunito Sans" w:hAnsi="Nunito Sans" w:eastAsia="Nunito Sans" w:cs="Nunito Sans"/>
+          <w:b/>
+          <w:bCs/>
+          <w:color w:val="4A3A36"/>
+          <w:sz w:val="20"/>
+          <w:szCs w:val="20"/>
+        </w:rPr>
+        <w:t>Ask them about it.</w:t>
+      </w:r>
+      <w:r>
+        <w:rPr>
+          <w:rFonts w:ascii="Nunito Sans" w:hAnsi="Nunito Sans" w:eastAsia="Nunito Sans" w:cs="Nunito Sans"/>
           <w:color w:val="4A3A36"/>
           <w:sz w:val="20"/>
           <w:szCs w:val="20"/>
@@ -1344,24 +1193,18 @@
       </w:pPr>
       <w:r>
         <w:rPr>
-          <w:rFonts w:ascii="Nunito Sans" w:cs="Nunito Sans" w:eastAsia="Nunito Sans" w:hAnsi="Nunito Sans"/>
-          <w:b/>
-          <w:bCs/>
-          <w:i w:val="false"/>
-          <w:iCs w:val="false"/>
-          <w:color w:val="4A3A36"/>
-          <w:sz w:val="20"/>
-          <w:szCs w:val="20"/>
-        </w:rPr>
-        <w:t xml:space="preserve">Come to the showcase.</w:t>
-      </w:r>
-      <w:r>
-        <w:rPr>
-          <w:rFonts w:ascii="Nunito Sans" w:cs="Nunito Sans" w:eastAsia="Nunito Sans" w:hAnsi="Nunito Sans"/>
-          <w:b w:val="false"/>
-          <w:bCs w:val="false"/>
-          <w:i w:val="false"/>
-          <w:iCs w:val="false"/>
+          <w:rFonts w:ascii="Nunito Sans" w:hAnsi="Nunito Sans" w:eastAsia="Nunito Sans" w:cs="Nunito Sans"/>
+          <w:b/>
+          <w:bCs/>
+          <w:color w:val="4A3A36"/>
+          <w:sz w:val="20"/>
+          <w:szCs w:val="20"/>
+        </w:rPr>
+        <w:t>Come to the showcase.</w:t>
+      </w:r>
+      <w:r>
+        <w:rPr>
+          <w:rFonts w:ascii="Nunito Sans" w:hAnsi="Nunito Sans" w:eastAsia="Nunito Sans" w:cs="Nunito Sans"/>
           <w:color w:val="4A3A36"/>
           <w:sz w:val="20"/>
           <w:szCs w:val="20"/>
@@ -1373,20 +1216,18 @@
       <w:pPr>
         <w:pStyle w:val="Heading3"/>
         <w:keepNext/>
-        <w:spacing w:after="80" w:before="260"/>
-      </w:pPr>
-      <w:r>
-        <w:rPr>
-          <w:rFonts w:ascii="Fredoka" w:cs="Fredoka" w:eastAsia="Fredoka" w:hAnsi="Fredoka"/>
-          <w:b/>
-          <w:bCs/>
-          <w:i w:val="false"/>
-          <w:iCs w:val="false"/>
+        <w:spacing w:before="260" w:after="80"/>
+      </w:pPr>
+      <w:r>
+        <w:rPr>
+          <w:rFonts w:ascii="Fredoka" w:hAnsi="Fredoka" w:eastAsia="Fredoka" w:cs="Fredoka"/>
+          <w:b/>
+          <w:bCs/>
           <w:color w:val="2E1015"/>
           <w:sz w:val="23"/>
           <w:szCs w:val="23"/>
         </w:rPr>
-        <w:t xml:space="preserve">A note on how we run it</w:t>
+        <w:t>A note on how we run it</w:t>
       </w:r>
     </w:p>
     <w:p>
@@ -1395,16 +1236,12 @@
       </w:pPr>
       <w:r>
         <w:rPr>
-          <w:rFonts w:ascii="Nunito Sans" w:cs="Nunito Sans" w:eastAsia="Nunito Sans" w:hAnsi="Nunito Sans"/>
-          <w:b w:val="false"/>
-          <w:bCs w:val="false"/>
-          <w:i w:val="false"/>
-          <w:iCs w:val="false"/>
-          <w:color w:val="4A3A36"/>
-          <w:sz w:val="20"/>
-          <w:szCs w:val="20"/>
-        </w:rPr>
-        <w:t xml:space="preserve">This is volunteer-run. There are always at least two adults in the room, and we keep the group small enough that every child gets help within a minute of putting their hand up. Nothing is graded, there are no tests, and we won't chase homework — the aim is that they finish the eight weeks wanting to carry on, not that they tick every box.</w:t>
+          <w:rFonts w:ascii="Nunito Sans" w:hAnsi="Nunito Sans" w:eastAsia="Nunito Sans" w:cs="Nunito Sans"/>
+          <w:color w:val="4A3A36"/>
+          <w:sz w:val="20"/>
+          <w:szCs w:val="20"/>
+        </w:rPr>
+        <w:t>This is volunteer-run. There are always at least two adults in the room, and we keep the group small enough that every child gets help within a minute of putting their hand up. Nothing is graded, there are no tests, and we won't chase homework — the aim is that they finish the eight weeks wanting to carry on, not that they tick every box.</w:t>
       </w:r>
     </w:p>
     <w:p>
@@ -1413,16 +1250,12 @@
       </w:pPr>
       <w:r>
         <w:rPr>
-          <w:rFonts w:ascii="Nunito Sans" w:cs="Nunito Sans" w:eastAsia="Nunito Sans" w:hAnsi="Nunito Sans"/>
-          <w:b w:val="false"/>
-          <w:bCs w:val="false"/>
-          <w:i w:val="false"/>
-          <w:iCs w:val="false"/>
-          <w:color w:val="4A3A36"/>
-          <w:sz w:val="20"/>
-          <w:szCs w:val="20"/>
-        </w:rPr>
-        <w:t xml:space="preserve">If your child misses a week, don't worry. We keep a saved copy of the project at every stage, so we can get them straight back up to speed.</w:t>
+          <w:rFonts w:ascii="Nunito Sans" w:hAnsi="Nunito Sans" w:eastAsia="Nunito Sans" w:cs="Nunito Sans"/>
+          <w:color w:val="4A3A36"/>
+          <w:sz w:val="20"/>
+          <w:szCs w:val="20"/>
+        </w:rPr>
+        <w:t>If your child misses a week, don't worry. We keep a saved copy of the project at every stage, so we can get them straight back up to speed.</w:t>
       </w:r>
     </w:p>
     <w:p>
@@ -1431,36 +1264,30 @@
       </w:pPr>
       <w:r>
         <w:rPr>
-          <w:rFonts w:ascii="Nunito Sans" w:cs="Nunito Sans" w:eastAsia="Nunito Sans" w:hAnsi="Nunito Sans"/>
-          <w:b w:val="false"/>
-          <w:bCs w:val="false"/>
-          <w:i w:val="false"/>
-          <w:iCs w:val="false"/>
-          <w:color w:val="4A3A36"/>
-          <w:sz w:val="20"/>
-          <w:szCs w:val="20"/>
-        </w:rPr>
-        <w:t xml:space="preserve">The same goes for the fee. If it is difficult for your family, say so and we will sort it out quietly — we would far rather have your child in the room.</w:t>
+          <w:rFonts w:ascii="Nunito Sans" w:hAnsi="Nunito Sans" w:eastAsia="Nunito Sans" w:cs="Nunito Sans"/>
+          <w:color w:val="4A3A36"/>
+          <w:sz w:val="20"/>
+          <w:szCs w:val="20"/>
+        </w:rPr>
+        <w:t>The same goes for the fee. If it is difficult for your family, say so and we will sort it out quietly — we would far rather have your child in the room.</w:t>
       </w:r>
     </w:p>
     <w:p>
       <w:pPr>
         <w:pStyle w:val="Heading3"/>
         <w:keepNext/>
-        <w:spacing w:after="80" w:before="260"/>
-      </w:pPr>
-      <w:r>
-        <w:rPr>
-          <w:rFonts w:ascii="Fredoka" w:cs="Fredoka" w:eastAsia="Fredoka" w:hAnsi="Fredoka"/>
-          <w:b/>
-          <w:bCs/>
-          <w:i w:val="false"/>
-          <w:iCs w:val="false"/>
+        <w:spacing w:before="260" w:after="80"/>
+      </w:pPr>
+      <w:r>
+        <w:rPr>
+          <w:rFonts w:ascii="Fredoka" w:hAnsi="Fredoka" w:eastAsia="Fredoka" w:cs="Fredoka"/>
+          <w:b/>
+          <w:bCs/>
           <w:color w:val="2E1015"/>
           <w:sz w:val="23"/>
           <w:szCs w:val="23"/>
         </w:rPr>
-        <w:t xml:space="preserve">Registering</w:t>
+        <w:t>Registering</w:t>
       </w:r>
     </w:p>
     <w:p>
@@ -1469,18 +1296,15 @@
       </w:pPr>
       <w:r>
         <w:rPr>
-          <w:rFonts w:ascii="Nunito Sans" w:cs="Nunito Sans" w:eastAsia="Nunito Sans" w:hAnsi="Nunito Sans"/>
-          <w:b/>
-          <w:bCs/>
-          <w:i w:val="false"/>
-          <w:iCs w:val="false"/>
+          <w:rFonts w:ascii="Nunito Sans" w:hAnsi="Nunito Sans" w:eastAsia="Nunito Sans" w:cs="Nunito Sans"/>
+          <w:b/>
+          <w:bCs/>
           <w:color w:val="2E1015"/>
           <w:sz w:val="20"/>
           <w:szCs w:val="20"/>
           <w:highlight w:val="yellow"/>
-          <w:highlightCs w:val="yellow"/>
-        </w:rPr>
-        <w:t xml:space="preserve">[REGISTRATION LINK OR PROCESS]</w:t>
+        </w:rPr>
+        <w:t>[REGISTRATION LINK OR PROCESS]</w:t>
       </w:r>
     </w:p>
     <w:p>
@@ -1489,16 +1313,12 @@
       </w:pPr>
       <w:r>
         <w:rPr>
-          <w:rFonts w:ascii="Nunito Sans" w:cs="Nunito Sans" w:eastAsia="Nunito Sans" w:hAnsi="Nunito Sans"/>
-          <w:b w:val="false"/>
-          <w:bCs w:val="false"/>
-          <w:i w:val="false"/>
-          <w:iCs w:val="false"/>
-          <w:color w:val="4A3A36"/>
-          <w:sz w:val="20"/>
-          <w:szCs w:val="20"/>
-        </w:rPr>
-        <w:t xml:space="preserve">Please also complete the consent and photo permission form before the first session — we can't start your child without it.</w:t>
+          <w:rFonts w:ascii="Nunito Sans" w:hAnsi="Nunito Sans" w:eastAsia="Nunito Sans" w:cs="Nunito Sans"/>
+          <w:color w:val="4A3A36"/>
+          <w:sz w:val="20"/>
+          <w:szCs w:val="20"/>
+        </w:rPr>
+        <w:t>Please also complete the consent and photo permission form before the first session — we can't start your child without it.</w:t>
       </w:r>
     </w:p>
     <w:p>
@@ -1507,16 +1327,12 @@
       </w:pPr>
       <w:r>
         <w:rPr>
-          <w:rFonts w:ascii="Nunito Sans" w:cs="Nunito Sans" w:eastAsia="Nunito Sans" w:hAnsi="Nunito Sans"/>
-          <w:b w:val="false"/>
-          <w:bCs w:val="false"/>
-          <w:i w:val="false"/>
-          <w:iCs w:val="false"/>
-          <w:color w:val="4A3A36"/>
-          <w:sz w:val="20"/>
-          <w:szCs w:val="20"/>
-        </w:rPr>
-        <w:t xml:space="preserve">If you have questions, or if your child has any needs we should know about so we can support them properly, please get in touch. We'd much rather know in advance.</w:t>
+          <w:rFonts w:ascii="Nunito Sans" w:hAnsi="Nunito Sans" w:eastAsia="Nunito Sans" w:cs="Nunito Sans"/>
+          <w:color w:val="4A3A36"/>
+          <w:sz w:val="20"/>
+          <w:szCs w:val="20"/>
+        </w:rPr>
+        <w:t>If you have questions, or if your child has any needs we should know about so we can support them properly, please get in touch. We'd much rather know in advance.</w:t>
       </w:r>
     </w:p>
     <w:p>
@@ -1525,16 +1341,12 @@
       </w:pPr>
       <w:r>
         <w:rPr>
-          <w:rFonts w:ascii="Nunito Sans" w:cs="Nunito Sans" w:eastAsia="Nunito Sans" w:hAnsi="Nunito Sans"/>
-          <w:b w:val="false"/>
-          <w:bCs w:val="false"/>
-          <w:i w:val="false"/>
-          <w:iCs w:val="false"/>
-          <w:color w:val="4A3A36"/>
-          <w:sz w:val="20"/>
-          <w:szCs w:val="20"/>
-        </w:rPr>
-        <w:t xml:space="preserve">Warm regards,</w:t>
+          <w:rFonts w:ascii="Nunito Sans" w:hAnsi="Nunito Sans" w:eastAsia="Nunito Sans" w:cs="Nunito Sans"/>
+          <w:color w:val="4A3A36"/>
+          <w:sz w:val="20"/>
+          <w:szCs w:val="20"/>
+        </w:rPr>
+        <w:t>Warm regards,</w:t>
       </w:r>
     </w:p>
     <w:p>
@@ -1543,44 +1355,34 @@
       </w:pPr>
       <w:r>
         <w:rPr>
-          <w:rFonts w:ascii="Nunito Sans" w:cs="Nunito Sans" w:eastAsia="Nunito Sans" w:hAnsi="Nunito Sans"/>
-          <w:b/>
-          <w:bCs/>
-          <w:i w:val="false"/>
-          <w:iCs w:val="false"/>
+          <w:rFonts w:ascii="Nunito Sans" w:hAnsi="Nunito Sans" w:eastAsia="Nunito Sans" w:cs="Nunito Sans"/>
+          <w:b/>
+          <w:bCs/>
           <w:color w:val="2E1015"/>
           <w:sz w:val="20"/>
           <w:szCs w:val="20"/>
           <w:highlight w:val="yellow"/>
-          <w:highlightCs w:val="yellow"/>
-        </w:rPr>
-        <w:t xml:space="preserve">[NAME]</w:t>
-      </w:r>
-      <w:r>
-        <w:br/>
-      </w:r>
-      <w:r>
-        <w:rPr>
-          <w:rFonts w:ascii="Nunito Sans" w:cs="Nunito Sans" w:eastAsia="Nunito Sans" w:hAnsi="Nunito Sans"/>
-          <w:b/>
-          <w:bCs/>
-          <w:i w:val="false"/>
-          <w:iCs w:val="false"/>
+        </w:rPr>
+        <w:t>[NAME]</w:t>
+      </w:r>
+      <w:r>
+        <w:br w:type="textWrapping"/>
+      </w:r>
+      <w:r>
+        <w:rPr>
+          <w:rFonts w:ascii="Nunito Sans" w:hAnsi="Nunito Sans" w:eastAsia="Nunito Sans" w:cs="Nunito Sans"/>
+          <w:b/>
+          <w:bCs/>
           <w:color w:val="2E1015"/>
           <w:sz w:val="20"/>
           <w:szCs w:val="20"/>
           <w:highlight w:val="yellow"/>
-          <w:highlightCs w:val="yellow"/>
-        </w:rPr>
-        <w:t xml:space="preserve">[ROLE]</w:t>
-      </w:r>
-      <w:r>
-        <w:rPr>
-          <w:rFonts w:ascii="Nunito Sans" w:cs="Nunito Sans" w:eastAsia="Nunito Sans" w:hAnsi="Nunito Sans"/>
-          <w:b w:val="false"/>
-          <w:bCs w:val="false"/>
-          <w:i w:val="false"/>
-          <w:iCs w:val="false"/>
+        </w:rPr>
+        <w:t>[ROLE]</w:t>
+      </w:r>
+      <w:r>
+        <w:rPr>
+          <w:rFonts w:ascii="Nunito Sans" w:hAnsi="Nunito Sans" w:eastAsia="Nunito Sans" w:cs="Nunito Sans"/>
           <w:color w:val="4A3A36"/>
           <w:sz w:val="20"/>
           <w:szCs w:val="20"/>
@@ -1589,26 +1391,19 @@
       </w:r>
       <w:r>
         <w:rPr>
-          <w:rFonts w:ascii="Nunito Sans" w:cs="Nunito Sans" w:eastAsia="Nunito Sans" w:hAnsi="Nunito Sans"/>
-          <w:b/>
-          <w:bCs/>
-          <w:i w:val="false"/>
-          <w:iCs w:val="false"/>
+          <w:rFonts w:ascii="Nunito Sans" w:hAnsi="Nunito Sans" w:eastAsia="Nunito Sans" w:cs="Nunito Sans"/>
+          <w:b/>
+          <w:bCs/>
           <w:color w:val="2E1015"/>
           <w:sz w:val="20"/>
           <w:szCs w:val="20"/>
           <w:highlight w:val="yellow"/>
-          <w:highlightCs w:val="yellow"/>
-        </w:rPr>
-        <w:t xml:space="preserve">[EMAIL]</w:t>
-      </w:r>
-      <w:r>
-        <w:rPr>
-          <w:rFonts w:ascii="Nunito Sans" w:cs="Nunito Sans" w:eastAsia="Nunito Sans" w:hAnsi="Nunito Sans"/>
-          <w:b w:val="false"/>
-          <w:bCs w:val="false"/>
-          <w:i w:val="false"/>
-          <w:iCs w:val="false"/>
+        </w:rPr>
+        <w:t>[EMAIL]</w:t>
+      </w:r>
+      <w:r>
+        <w:rPr>
+          <w:rFonts w:ascii="Nunito Sans" w:hAnsi="Nunito Sans" w:eastAsia="Nunito Sans" w:cs="Nunito Sans"/>
           <w:color w:val="4A3A36"/>
           <w:sz w:val="20"/>
           <w:szCs w:val="20"/>
@@ -1617,25 +1412,21 @@
       </w:r>
       <w:r>
         <w:rPr>
-          <w:rFonts w:ascii="Nunito Sans" w:cs="Nunito Sans" w:eastAsia="Nunito Sans" w:hAnsi="Nunito Sans"/>
-          <w:b/>
-          <w:bCs/>
-          <w:i w:val="false"/>
-          <w:iCs w:val="false"/>
+          <w:rFonts w:ascii="Nunito Sans" w:hAnsi="Nunito Sans" w:eastAsia="Nunito Sans" w:cs="Nunito Sans"/>
+          <w:b/>
+          <w:bCs/>
           <w:color w:val="2E1015"/>
           <w:sz w:val="20"/>
           <w:szCs w:val="20"/>
           <w:highlight w:val="yellow"/>
-          <w:highlightCs w:val="yellow"/>
-        </w:rPr>
-        <w:t xml:space="preserve">[PHONE]</w:t>
+        </w:rPr>
+        <w:t>[PHONE]</w:t>
       </w:r>
     </w:p>
     <w:sectPr>
       <w:footerReference w:type="default" r:id="rId7"/>
-      <w:pgSz w:w="11906" w:h="16838" w:orient="portrait"/>
+      <w:pgSz w:w="11906" w:h="16838"/>
       <w:pgMar w:top="1134" w:right="1134" w:bottom="1134" w:left="1134" w:header="708" w:footer="708" w:gutter="0"/>
-      <w:pgNumType/>
       <w:docGrid w:linePitch="360"/>
     </w:sectPr>
   </w:body>
@@ -1647,7 +1438,7 @@
 </file>
 
 <file path=word/endnotes.xml><?xml version="1.0" encoding="utf-8"?>
-<w:endnotes xmlns:wpc="http://schemas.microsoft.com/office/word/2010/wordprocessingCanvas" xmlns:mc="http://schemas.openxmlformats.org/markup-compatibility/2006" xmlns:o="urn:schemas-microsoft-com:office:office" xmlns:r="http://schemas.openxmlformats.org/officeDocument/2006/relationships" xmlns:m="http://schemas.openxmlformats.org/officeDocument/2006/math" xmlns:v="urn:schemas-microsoft-com:vml" xmlns:wp14="http://schemas.microsoft.com/office/word/2010/wordprocessingDrawing" xmlns:wp="http://schemas.openxmlformats.org/drawingml/2006/wordprocessingDrawing" xmlns:w10="urn:schemas-microsoft-com:office:word" xmlns:w="http://schemas.openxmlformats.org/wordprocessingml/2006/main" xmlns:w14="http://schemas.microsoft.com/office/word/2010/wordml" xmlns:w15="http://schemas.microsoft.com/office/word/2012/wordml" xmlns:wpg="http://schemas.microsoft.com/office/word/2010/wordprocessingGroup" xmlns:wpi="http://schemas.microsoft.com/office/word/2010/wordprocessingInk" xmlns:wne="http://schemas.microsoft.com/office/word/2006/wordml" xmlns:wps="http://schemas.microsoft.com/office/word/2010/wordprocessingShape" mc:Ignorable="w14 w15 wp14">
+<w:endnotes xmlns:wpc="http://schemas.microsoft.com/office/word/2010/wordprocessingCanvas" xmlns:cx="http://schemas.microsoft.com/office/drawing/2014/chartex" xmlns:cx1="http://schemas.microsoft.com/office/drawing/2015/9/8/chartex" xmlns:cx2="http://schemas.microsoft.com/office/drawing/2015/10/21/chartex" xmlns:cx3="http://schemas.microsoft.com/office/drawing/2016/5/9/chartex" xmlns:cx4="http://schemas.microsoft.com/office/drawing/2016/5/10/chartex" xmlns:cx5="http://schemas.microsoft.com/office/drawing/2016/5/11/chartex" xmlns:cx6="http://schemas.microsoft.com/office/drawing/2016/5/12/chartex" xmlns:cx7="http://schemas.microsoft.com/office/drawing/2016/5/13/chartex" xmlns:cx8="http://schemas.microsoft.com/office/drawing/2016/5/14/chartex" xmlns:mc="http://schemas.openxmlformats.org/markup-compatibility/2006" xmlns:aink="http://schemas.microsoft.com/office/drawing/2016/ink" xmlns:am3d="http://schemas.microsoft.com/office/drawing/2017/model3d" xmlns:o="urn:schemas-microsoft-com:office:office" xmlns:oel="http://schemas.microsoft.com/office/2019/extlst" xmlns:r="http://schemas.openxmlformats.org/officeDocument/2006/relationships" xmlns:m="http://schemas.openxmlformats.org/officeDocument/2006/math" xmlns:v="urn:schemas-microsoft-com:vml" xmlns:wp14="http://schemas.microsoft.com/office/word/2010/wordprocessingDrawing" xmlns:wp="http://schemas.openxmlformats.org/drawingml/2006/wordprocessingDrawing" xmlns:w10="urn:schemas-microsoft-com:office:word" xmlns:w="http://schemas.openxmlformats.org/wordprocessingml/2006/main" xmlns:w14="http://schemas.microsoft.com/office/word/2010/wordml" xmlns:w15="http://schemas.microsoft.com/office/word/2012/wordml" xmlns:w16cex="http://schemas.microsoft.com/office/word/2018/wordml/cex" xmlns:w16cid="http://schemas.microsoft.com/office/word/2016/wordml/cid" xmlns:w16="http://schemas.microsoft.com/office/word/2018/wordml" xmlns:w16du="http://schemas.microsoft.com/office/word/2023/wordml/word16du" xmlns:w16sdtdh="http://schemas.microsoft.com/office/word/2020/wordml/sdtdatahash" xmlns:w16sdtfl="http://schemas.microsoft.com/office/word/2024/wordml/sdtformatlock" xmlns:w16se="http://schemas.microsoft.com/office/word/2015/wordml/symex" xmlns:wpg="http://schemas.microsoft.com/office/word/2010/wordprocessingGroup" xmlns:wpi="http://schemas.microsoft.com/office/word/2010/wordprocessingInk" xmlns:wne="http://schemas.microsoft.com/office/word/2006/wordml" xmlns:wps="http://schemas.microsoft.com/office/word/2010/wordprocessingShape" mc:Ignorable="w14 w15 w16se w16cid w16 w16cex w16sdtdh w16sdtfl w16du wp14">
   <w:endnote w:type="separator" w:id="-1">
     <w:p>
       <w:pPr>
@@ -1684,14 +1475,14 @@
 </file>
 
 <file path=word/footer1.xml><?xml version="1.0" encoding="utf-8"?>
-<w:ftr xmlns:wpc="http://schemas.microsoft.com/office/word/2010/wordprocessingCanvas" xmlns:mc="http://schemas.openxmlformats.org/markup-compatibility/2006" xmlns:o="urn:schemas-microsoft-com:office:office" xmlns:r="http://schemas.openxmlformats.org/officeDocument/2006/relationships" xmlns:m="http://schemas.openxmlformats.org/officeDocument/2006/math" xmlns:v="urn:schemas-microsoft-com:vml" xmlns:wp14="http://schemas.microsoft.com/office/word/2010/wordprocessingDrawing" xmlns:wp="http://schemas.openxmlformats.org/drawingml/2006/wordprocessingDrawing" xmlns:w10="urn:schemas-microsoft-com:office:word" xmlns:w="http://schemas.openxmlformats.org/wordprocessingml/2006/main" xmlns:w14="http://schemas.microsoft.com/office/word/2010/wordml" xmlns:w15="http://schemas.microsoft.com/office/word/2012/wordml" xmlns:wpg="http://schemas.microsoft.com/office/word/2010/wordprocessingGroup" xmlns:wpi="http://schemas.microsoft.com/office/word/2010/wordprocessingInk" xmlns:wne="http://schemas.microsoft.com/office/word/2006/wordml" xmlns:wps="http://schemas.microsoft.com/office/word/2010/wordprocessingShape">
+<w:ftr xmlns:wpc="http://schemas.microsoft.com/office/word/2010/wordprocessingCanvas" xmlns:mc="http://schemas.openxmlformats.org/markup-compatibility/2006" xmlns:o="urn:schemas-microsoft-com:office:office" xmlns:r="http://schemas.openxmlformats.org/officeDocument/2006/relationships" xmlns:m="http://schemas.openxmlformats.org/officeDocument/2006/math" xmlns:v="urn:schemas-microsoft-com:vml" xmlns:wp14="http://schemas.microsoft.com/office/word/2010/wordprocessingDrawing" xmlns:wp="http://schemas.openxmlformats.org/drawingml/2006/wordprocessingDrawing" xmlns:w10="urn:schemas-microsoft-com:office:word" xmlns:w="http://schemas.openxmlformats.org/wordprocessingml/2006/main" xmlns:w14="http://schemas.microsoft.com/office/word/2010/wordml" xmlns:w15="http://schemas.microsoft.com/office/word/2012/wordml" xmlns:w16se="http://schemas.microsoft.com/office/word/2015/wordml/symex" xmlns:w16cid="http://schemas.microsoft.com/office/word/2016/wordml/cid" xmlns:w16="http://schemas.microsoft.com/office/word/2018/wordml" xmlns:w16cex="http://schemas.microsoft.com/office/word/2018/wordml/cex" xmlns:w16sdtdh="http://schemas.microsoft.com/office/word/2020/wordml/sdtdatahash" xmlns:wne="http://schemas.microsoft.com/office/word/2006/wordml" xmlns:wpg="http://schemas.microsoft.com/office/word/2010/wordprocessingGroup" xmlns:wps="http://schemas.microsoft.com/office/word/2010/wordprocessingShape">
   <w:p>
     <w:pPr>
       <w:jc w:val="left"/>
     </w:pPr>
     <w:r>
       <w:rPr>
-        <w:rFonts w:ascii="Nunito Sans" w:cs="Nunito Sans" w:eastAsia="Nunito Sans" w:hAnsi="Nunito Sans"/>
+        <w:rFonts w:ascii="Nunito Sans" w:hAnsi="Nunito Sans" w:eastAsia="Nunito Sans" w:cs="Nunito Sans"/>
         <w:color w:val="8A7A72"/>
         <w:sz w:val="14"/>
         <w:szCs w:val="14"/>
@@ -1700,14 +1491,38 @@
     </w:r>
     <w:r>
       <w:rPr>
-        <w:rFonts w:ascii="Nunito Sans" w:cs="Nunito Sans" w:eastAsia="Nunito Sans" w:hAnsi="Nunito Sans"/>
+        <w:rFonts w:ascii="Nunito Sans" w:hAnsi="Nunito Sans" w:eastAsia="Nunito Sans" w:cs="Nunito Sans"/>
         <w:color w:val="8A7A72"/>
         <w:sz w:val="14"/>
         <w:szCs w:val="14"/>
       </w:rPr>
       <w:fldChar w:fldCharType="begin"/>
-      <w:instrText xml:space="preserve">PAGE</w:instrText>
+    </w:r>
+    <w:r>
+      <w:rPr>
+        <w:rFonts w:ascii="Nunito Sans" w:hAnsi="Nunito Sans" w:eastAsia="Nunito Sans" w:cs="Nunito Sans"/>
+        <w:color w:val="8A7A72"/>
+        <w:sz w:val="14"/>
+        <w:szCs w:val="14"/>
+      </w:rPr>
+      <w:instrText>PAGE</w:instrText>
+    </w:r>
+    <w:r>
+      <w:rPr>
+        <w:rFonts w:ascii="Nunito Sans" w:hAnsi="Nunito Sans" w:eastAsia="Nunito Sans" w:cs="Nunito Sans"/>
+        <w:color w:val="8A7A72"/>
+        <w:sz w:val="14"/>
+        <w:szCs w:val="14"/>
+      </w:rPr>
       <w:fldChar w:fldCharType="separate"/>
+    </w:r>
+    <w:r>
+      <w:rPr>
+        <w:rFonts w:ascii="Nunito Sans" w:hAnsi="Nunito Sans" w:eastAsia="Nunito Sans" w:cs="Nunito Sans"/>
+        <w:color w:val="8A7A72"/>
+        <w:sz w:val="14"/>
+        <w:szCs w:val="14"/>
+      </w:rPr>
       <w:fldChar w:fldCharType="end"/>
     </w:r>
   </w:p>
@@ -1715,7 +1530,7 @@
 </file>
 
 <file path=word/footnotes.xml><?xml version="1.0" encoding="utf-8"?>
-<w:footnotes xmlns:wpc="http://schemas.microsoft.com/office/word/2010/wordprocessingCanvas" xmlns:mc="http://schemas.openxmlformats.org/markup-compatibility/2006" xmlns:o="urn:schemas-microsoft-com:office:office" xmlns:r="http://schemas.openxmlformats.org/officeDocument/2006/relationships" xmlns:m="http://schemas.openxmlformats.org/officeDocument/2006/math" xmlns:v="urn:schemas-microsoft-com:vml" xmlns:wp14="http://schemas.microsoft.com/office/word/2010/wordprocessingDrawing" xmlns:wp="http://schemas.openxmlformats.org/drawingml/2006/wordprocessingDrawing" xmlns:w10="urn:schemas-microsoft-com:office:word" xmlns:w="http://schemas.openxmlformats.org/wordprocessingml/2006/main" xmlns:w14="http://schemas.microsoft.com/office/word/2010/wordml" xmlns:w15="http://schemas.microsoft.com/office/word/2012/wordml" xmlns:wpg="http://schemas.microsoft.com/office/word/2010/wordprocessingGroup" xmlns:wpi="http://schemas.microsoft.com/office/word/2010/wordprocessingInk" xmlns:wne="http://schemas.microsoft.com/office/word/2006/wordml" xmlns:wps="http://schemas.microsoft.com/office/word/2010/wordprocessingShape" mc:Ignorable="w14 w15 wp14">
+<w:footnotes xmlns:wpc="http://schemas.microsoft.com/office/word/2010/wordprocessingCanvas" xmlns:cx="http://schemas.microsoft.com/office/drawing/2014/chartex" xmlns:cx1="http://schemas.microsoft.com/office/drawing/2015/9/8/chartex" xmlns:cx2="http://schemas.microsoft.com/office/drawing/2015/10/21/chartex" xmlns:cx3="http://schemas.microsoft.com/office/drawing/2016/5/9/chartex" xmlns:cx4="http://schemas.microsoft.com/office/drawing/2016/5/10/chartex" xmlns:cx5="http://schemas.microsoft.com/office/drawing/2016/5/11/chartex" xmlns:cx6="http://schemas.microsoft.com/office/drawing/2016/5/12/chartex" xmlns:cx7="http://schemas.microsoft.com/office/drawing/2016/5/13/chartex" xmlns:cx8="http://schemas.microsoft.com/office/drawing/2016/5/14/chartex" xmlns:mc="http://schemas.openxmlformats.org/markup-compatibility/2006" xmlns:aink="http://schemas.microsoft.com/office/drawing/2016/ink" xmlns:am3d="http://schemas.microsoft.com/office/drawing/2017/model3d" xmlns:o="urn:schemas-microsoft-com:office:office" xmlns:oel="http://schemas.microsoft.com/office/2019/extlst" xmlns:r="http://schemas.openxmlformats.org/officeDocument/2006/relationships" xmlns:m="http://schemas.openxmlformats.org/officeDocument/2006/math" xmlns:v="urn:schemas-microsoft-com:vml" xmlns:wp14="http://schemas.microsoft.com/office/word/2010/wordprocessingDrawing" xmlns:wp="http://schemas.openxmlformats.org/drawingml/2006/wordprocessingDrawing" xmlns:w10="urn:schemas-microsoft-com:office:word" xmlns:w="http://schemas.openxmlformats.org/wordprocessingml/2006/main" xmlns:w14="http://schemas.microsoft.com/office/word/2010/wordml" xmlns:w15="http://schemas.microsoft.com/office/word/2012/wordml" xmlns:w16cex="http://schemas.microsoft.com/office/word/2018/wordml/cex" xmlns:w16cid="http://schemas.microsoft.com/office/word/2016/wordml/cid" xmlns:w16="http://schemas.microsoft.com/office/word/2018/wordml" xmlns:w16du="http://schemas.microsoft.com/office/word/2023/wordml/word16du" xmlns:w16sdtdh="http://schemas.microsoft.com/office/word/2020/wordml/sdtdatahash" xmlns:w16sdtfl="http://schemas.microsoft.com/office/word/2024/wordml/sdtformatlock" xmlns:w16se="http://schemas.microsoft.com/office/word/2015/wordml/symex" xmlns:wpg="http://schemas.microsoft.com/office/word/2010/wordprocessingGroup" xmlns:wpi="http://schemas.microsoft.com/office/word/2010/wordprocessingInk" xmlns:wne="http://schemas.microsoft.com/office/word/2006/wordml" xmlns:wps="http://schemas.microsoft.com/office/word/2010/wordprocessingShape" mc:Ignorable="w14 w15 w16se w16cid w16 w16cex w16sdtdh w16sdtfl w16du wp14">
   <w:footnote w:type="separator" w:id="-1">
     <w:p>
       <w:pPr>

</xml_diff>